<commit_message>
Nazarbek edited docx file
</commit_message>
<xml_diff>
--- a/Software engineering (MP).docx
+++ b/Software engineering (MP).docx
@@ -114,6 +114,7 @@
           <w:b/>
           <w:bCs/>
           <w:i w:val="false"/>
+          <w:i w:val="false"/>
           <w:caps w:val="false"/>
           <w:smallCaps w:val="false"/>
           <w:color w:val="000000"/>
@@ -193,7 +194,7 @@
         <w:pStyle w:val="ListParagraph"/>
         <w:numPr>
           <w:ilvl w:val="0"/>
-          <w:numId w:val="4"/>
+          <w:numId w:val="3"/>
         </w:numPr>
         <w:rPr>
           <w:b/>
@@ -268,7 +269,7 @@
         <w:pStyle w:val="ListParagraph"/>
         <w:numPr>
           <w:ilvl w:val="0"/>
-          <w:numId w:val="4"/>
+          <w:numId w:val="3"/>
         </w:numPr>
         <w:rPr>
           <w:b/>
@@ -322,7 +323,7 @@
         <w:pStyle w:val="TextBody"/>
         <w:numPr>
           <w:ilvl w:val="0"/>
-          <w:numId w:val="6"/>
+          <w:numId w:val="5"/>
         </w:numPr>
         <w:tabs>
           <w:tab w:val="clear" w:pos="720"/>
@@ -340,6 +341,103 @@
           <w:szCs w:val="24"/>
         </w:rPr>
         <w:t>To provide fast and accurate route planning for different vehicle types</w:t>
+      </w:r>
+    </w:p>
+    <w:p>
+      <w:pPr>
+        <w:pStyle w:val="TextBody"/>
+        <w:numPr>
+          <w:ilvl w:val="0"/>
+          <w:numId w:val="5"/>
+        </w:numPr>
+        <w:tabs>
+          <w:tab w:val="clear" w:pos="720"/>
+          <w:tab w:val="left" w:pos="0" w:leader="none"/>
+        </w:tabs>
+        <w:ind w:left="707" w:hanging="283"/>
+        <w:rPr>
+          <w:sz w:val="24"/>
+          <w:szCs w:val="24"/>
+        </w:rPr>
+      </w:pPr>
+      <w:r>
+        <w:rPr>
+          <w:sz w:val="24"/>
+          <w:szCs w:val="24"/>
+        </w:rPr>
+        <w:t>To offer user-friendly navigation with distance, elevation, and time estimation</w:t>
+      </w:r>
+    </w:p>
+    <w:p>
+      <w:pPr>
+        <w:pStyle w:val="TextBody"/>
+        <w:numPr>
+          <w:ilvl w:val="0"/>
+          <w:numId w:val="5"/>
+        </w:numPr>
+        <w:tabs>
+          <w:tab w:val="clear" w:pos="720"/>
+          <w:tab w:val="left" w:pos="0" w:leader="none"/>
+        </w:tabs>
+        <w:ind w:left="707" w:hanging="283"/>
+        <w:rPr>
+          <w:sz w:val="24"/>
+          <w:szCs w:val="24"/>
+        </w:rPr>
+      </w:pPr>
+      <w:r>
+        <w:rPr>
+          <w:sz w:val="24"/>
+          <w:szCs w:val="24"/>
+        </w:rPr>
+        <w:t>To allow both technical (</w:t>
+      </w:r>
+      <w:r>
+        <w:rPr>
+          <w:b/>
+          <w:bCs/>
+          <w:sz w:val="24"/>
+          <w:szCs w:val="24"/>
+        </w:rPr>
+        <w:t>Python-based</w:t>
+      </w:r>
+      <w:r>
+        <w:rPr>
+          <w:sz w:val="24"/>
+          <w:szCs w:val="24"/>
+        </w:rPr>
+        <w:t>) and non-technical (</w:t>
+      </w:r>
+      <w:r>
+        <w:rPr>
+          <w:b/>
+          <w:bCs/>
+          <w:sz w:val="24"/>
+          <w:szCs w:val="24"/>
+        </w:rPr>
+        <w:t>web-based</w:t>
+      </w:r>
+      <w:r>
+        <w:rPr>
+          <w:sz w:val="24"/>
+          <w:szCs w:val="24"/>
+        </w:rPr>
+        <w:t>) users to interact with the service</w:t>
+      </w:r>
+    </w:p>
+    <w:p>
+      <w:pPr>
+        <w:pStyle w:val="Normal"/>
+        <w:spacing w:beforeAutospacing="1" w:afterAutospacing="1"/>
+        <w:ind w:firstLine="360"/>
+        <w:rPr/>
+      </w:pPr>
+      <w:r>
+        <w:rPr>
+          <w:rStyle w:val="Strong"/>
+          <w:color w:val="000000"/>
+        </w:rPr>
+        <w:t>Deliverables include:</w:t>
       </w:r>
     </w:p>
     <w:p>
@@ -349,11 +447,7 @@
           <w:ilvl w:val="0"/>
           <w:numId w:val="6"/>
         </w:numPr>
-        <w:tabs>
-          <w:tab w:val="clear" w:pos="720"/>
-          <w:tab w:val="left" w:pos="0" w:leader="none"/>
-        </w:tabs>
-        <w:ind w:left="707" w:hanging="283"/>
+        <w:spacing w:beforeAutospacing="1" w:afterAutospacing="1"/>
         <w:rPr>
           <w:sz w:val="24"/>
           <w:szCs w:val="24"/>
@@ -364,79 +458,7 @@
           <w:sz w:val="24"/>
           <w:szCs w:val="24"/>
         </w:rPr>
-        <w:t>To offer user-friendly navigation with distance, elevation, and time estimation</w:t>
-      </w:r>
-    </w:p>
-    <w:p>
-      <w:pPr>
-        <w:pStyle w:val="TextBody"/>
-        <w:numPr>
-          <w:ilvl w:val="0"/>
-          <w:numId w:val="6"/>
-        </w:numPr>
-        <w:tabs>
-          <w:tab w:val="clear" w:pos="720"/>
-          <w:tab w:val="left" w:pos="0" w:leader="none"/>
-        </w:tabs>
-        <w:ind w:left="707" w:hanging="283"/>
-        <w:rPr>
-          <w:sz w:val="24"/>
-          <w:szCs w:val="24"/>
-        </w:rPr>
-      </w:pPr>
-      <w:r>
-        <w:rPr>
-          <w:sz w:val="24"/>
-          <w:szCs w:val="24"/>
-        </w:rPr>
-        <w:t>To allow both technical (</w:t>
-      </w:r>
-      <w:r>
-        <w:rPr>
-          <w:b/>
-          <w:bCs/>
-          <w:sz w:val="24"/>
-          <w:szCs w:val="24"/>
-        </w:rPr>
-        <w:t>Python-based</w:t>
-      </w:r>
-      <w:r>
-        <w:rPr>
-          <w:sz w:val="24"/>
-          <w:szCs w:val="24"/>
-        </w:rPr>
-        <w:t>) and non-technical (</w:t>
-      </w:r>
-      <w:r>
-        <w:rPr>
-          <w:b/>
-          <w:bCs/>
-          <w:sz w:val="24"/>
-          <w:szCs w:val="24"/>
-        </w:rPr>
-        <w:t>web-based</w:t>
-      </w:r>
-      <w:r>
-        <w:rPr>
-          <w:sz w:val="24"/>
-          <w:szCs w:val="24"/>
-        </w:rPr>
-        <w:t>) users to interact with the service</w:t>
-      </w:r>
-    </w:p>
-    <w:p>
-      <w:pPr>
-        <w:pStyle w:val="Normal"/>
-        <w:spacing w:beforeAutospacing="1" w:afterAutospacing="1"/>
-        <w:ind w:firstLine="360"/>
-        <w:rPr/>
-      </w:pPr>
-      <w:r>
-        <w:rPr>
-          <w:rStyle w:val="Strong"/>
-          <w:color w:val="000000"/>
-        </w:rPr>
-        <w:t>Deliverables include:</w:t>
+        <w:t>Web-based application (frontend + backend)</w:t>
       </w:r>
     </w:p>
     <w:p>
@@ -446,7 +468,11 @@
           <w:ilvl w:val="0"/>
           <w:numId w:val="7"/>
         </w:numPr>
-        <w:spacing w:beforeAutospacing="1" w:afterAutospacing="1"/>
+        <w:tabs>
+          <w:tab w:val="clear" w:pos="720"/>
+          <w:tab w:val="left" w:pos="0" w:leader="none"/>
+        </w:tabs>
+        <w:ind w:left="720" w:hanging="283"/>
         <w:rPr>
           <w:sz w:val="24"/>
           <w:szCs w:val="24"/>
@@ -457,7 +483,7 @@
           <w:sz w:val="24"/>
           <w:szCs w:val="24"/>
         </w:rPr>
-        <w:t>Web-based application (frontend + backend)</w:t>
+        <w:t>Python module for programmatic route access</w:t>
       </w:r>
     </w:p>
     <w:p>
@@ -472,17 +498,44 @@
           <w:tab w:val="left" w:pos="0" w:leader="none"/>
         </w:tabs>
         <w:ind w:left="720" w:hanging="283"/>
+        <w:rPr/>
+      </w:pPr>
+      <w:r>
         <w:rPr>
           <w:sz w:val="24"/>
           <w:szCs w:val="24"/>
         </w:rPr>
-      </w:pPr>
-      <w:r>
-        <w:rPr>
+        <w:t>REST API layer (</w:t>
+      </w:r>
+      <w:r>
+        <w:rPr>
+          <w:rStyle w:val="SourceText"/>
           <w:sz w:val="24"/>
           <w:szCs w:val="24"/>
         </w:rPr>
-        <w:t>Python module for programmatic route access</w:t>
+        <w:t>/api/route</w:t>
+      </w:r>
+      <w:r>
+        <w:rPr>
+          <w:sz w:val="24"/>
+          <w:szCs w:val="24"/>
+        </w:rPr>
+        <w:t xml:space="preserve">, </w:t>
+      </w:r>
+      <w:r>
+        <w:rPr>
+          <w:rStyle w:val="SourceText"/>
+          <w:sz w:val="24"/>
+          <w:szCs w:val="24"/>
+        </w:rPr>
+        <w:t>/api/isochrone</w:t>
+      </w:r>
+      <w:r>
+        <w:rPr>
+          <w:sz w:val="24"/>
+          <w:szCs w:val="24"/>
+        </w:rPr>
+        <w:t>, etc.)</w:t>
       </w:r>
     </w:p>
     <w:p>
@@ -497,44 +550,17 @@
           <w:tab w:val="left" w:pos="0" w:leader="none"/>
         </w:tabs>
         <w:ind w:left="720" w:hanging="283"/>
-        <w:rPr/>
-      </w:pPr>
-      <w:r>
         <w:rPr>
           <w:sz w:val="24"/>
           <w:szCs w:val="24"/>
         </w:rPr>
-        <w:t>REST API layer (</w:t>
-      </w:r>
-      <w:r>
-        <w:rPr>
-          <w:rStyle w:val="SourceText"/>
+      </w:pPr>
+      <w:r>
+        <w:rPr>
           <w:sz w:val="24"/>
           <w:szCs w:val="24"/>
         </w:rPr>
-        <w:t>/api/route</w:t>
-      </w:r>
-      <w:r>
-        <w:rPr>
-          <w:sz w:val="24"/>
-          <w:szCs w:val="24"/>
-        </w:rPr>
-        <w:t xml:space="preserve">, </w:t>
-      </w:r>
-      <w:r>
-        <w:rPr>
-          <w:rStyle w:val="SourceText"/>
-          <w:sz w:val="24"/>
-          <w:szCs w:val="24"/>
-        </w:rPr>
-        <w:t>/api/isochrone</w:t>
-      </w:r>
-      <w:r>
-        <w:rPr>
-          <w:sz w:val="24"/>
-          <w:szCs w:val="24"/>
-        </w:rPr>
-        <w:t>, etc.)</w:t>
+        <w:t>Documentation (README, installation guides)</w:t>
       </w:r>
     </w:p>
     <w:p>
@@ -559,7 +585,7 @@
           <w:sz w:val="24"/>
           <w:szCs w:val="24"/>
         </w:rPr>
-        <w:t>Documentation (README, installation guides)</w:t>
+        <w:t>Automated test scripts</w:t>
       </w:r>
     </w:p>
     <w:p>
@@ -574,17 +600,29 @@
           <w:tab w:val="left" w:pos="0" w:leader="none"/>
         </w:tabs>
         <w:ind w:left="720" w:hanging="283"/>
+        <w:rPr/>
+      </w:pPr>
+      <w:r>
         <w:rPr>
           <w:sz w:val="24"/>
           <w:szCs w:val="24"/>
         </w:rPr>
-      </w:pPr>
-      <w:r>
-        <w:rPr>
+        <w:t xml:space="preserve">Deployment-ready configuration using </w:t>
+      </w:r>
+      <w:r>
+        <w:rPr>
+          <w:rStyle w:val="SourceText"/>
           <w:sz w:val="24"/>
           <w:szCs w:val="24"/>
         </w:rPr>
-        <w:t>Automated test scripts</w:t>
+        <w:t>.env</w:t>
+      </w:r>
+      <w:r>
+        <w:rPr>
+          <w:sz w:val="24"/>
+          <w:szCs w:val="24"/>
+        </w:rPr>
+        <w:t xml:space="preserve"> files</w:t>
       </w:r>
     </w:p>
     <w:p>
@@ -599,29 +637,17 @@
           <w:tab w:val="left" w:pos="0" w:leader="none"/>
         </w:tabs>
         <w:ind w:left="720" w:hanging="283"/>
-        <w:rPr/>
-      </w:pPr>
-      <w:r>
         <w:rPr>
           <w:sz w:val="24"/>
           <w:szCs w:val="24"/>
         </w:rPr>
-        <w:t xml:space="preserve">Deployment-ready configuration using </w:t>
-      </w:r>
-      <w:r>
-        <w:rPr>
-          <w:rStyle w:val="SourceText"/>
+      </w:pPr>
+      <w:r>
+        <w:rPr>
           <w:sz w:val="24"/>
           <w:szCs w:val="24"/>
         </w:rPr>
-        <w:t>.env</w:t>
-      </w:r>
-      <w:r>
-        <w:rPr>
-          <w:sz w:val="24"/>
-          <w:szCs w:val="24"/>
-        </w:rPr>
-        <w:t xml:space="preserve"> files</w:t>
+        <w:t>Usage examples (basic and advanced)</w:t>
       </w:r>
     </w:p>
     <w:p>
@@ -646,7 +672,24 @@
           <w:sz w:val="24"/>
           <w:szCs w:val="24"/>
         </w:rPr>
-        <w:t>Usage examples (basic and advanced)</w:t>
+        <w:t>GitHub repository with full version control history</w:t>
+      </w:r>
+    </w:p>
+    <w:p>
+      <w:pPr>
+        <w:pStyle w:val="Normal"/>
+        <w:spacing w:beforeAutospacing="1" w:afterAutospacing="1"/>
+        <w:ind w:firstLine="360"/>
+        <w:rPr>
+          <w:color w:val="000000"/>
+        </w:rPr>
+      </w:pPr>
+      <w:r>
+        <w:rPr>
+          <w:rStyle w:val="Strong"/>
+          <w:color w:val="000000"/>
+        </w:rPr>
+        <w:t>Objectives of the application:</w:t>
       </w:r>
     </w:p>
     <w:p>
@@ -654,13 +697,9 @@
         <w:pStyle w:val="TextBody"/>
         <w:numPr>
           <w:ilvl w:val="0"/>
-          <w:numId w:val="14"/>
+          <w:numId w:val="4"/>
         </w:numPr>
-        <w:tabs>
-          <w:tab w:val="clear" w:pos="720"/>
-          <w:tab w:val="left" w:pos="0" w:leader="none"/>
-        </w:tabs>
-        <w:ind w:left="720" w:hanging="283"/>
+        <w:spacing w:beforeAutospacing="1" w:after="0"/>
         <w:rPr>
           <w:sz w:val="24"/>
           <w:szCs w:val="24"/>
@@ -668,27 +707,11 @@
       </w:pPr>
       <w:r>
         <w:rPr>
+          <w:color w:val="000000"/>
           <w:sz w:val="24"/>
           <w:szCs w:val="24"/>
         </w:rPr>
-        <w:t>GitHub repository with full version control history</w:t>
-      </w:r>
-    </w:p>
-    <w:p>
-      <w:pPr>
-        <w:pStyle w:val="Normal"/>
-        <w:spacing w:beforeAutospacing="1" w:afterAutospacing="1"/>
-        <w:ind w:firstLine="360"/>
-        <w:rPr>
-          <w:color w:val="000000"/>
-        </w:rPr>
-      </w:pPr>
-      <w:r>
-        <w:rPr>
-          <w:rStyle w:val="Strong"/>
-          <w:color w:val="000000"/>
-        </w:rPr>
-        <w:t>Objectives of the application:</w:t>
+        <w:t>Build a navigation assistant accessible via both web and Python interfaces</w:t>
       </w:r>
     </w:p>
     <w:p>
@@ -696,9 +719,13 @@
         <w:pStyle w:val="TextBody"/>
         <w:numPr>
           <w:ilvl w:val="0"/>
-          <w:numId w:val="5"/>
+          <w:numId w:val="17"/>
         </w:numPr>
-        <w:spacing w:beforeAutospacing="1" w:after="0"/>
+        <w:tabs>
+          <w:tab w:val="clear" w:pos="720"/>
+          <w:tab w:val="left" w:pos="0" w:leader="none"/>
+        </w:tabs>
+        <w:ind w:left="720" w:hanging="283"/>
         <w:rPr>
           <w:sz w:val="24"/>
           <w:szCs w:val="24"/>
@@ -706,11 +733,10 @@
       </w:pPr>
       <w:r>
         <w:rPr>
-          <w:color w:val="000000"/>
           <w:sz w:val="24"/>
           <w:szCs w:val="24"/>
         </w:rPr>
-        <w:t>Build a navigation assistant accessible via both web and Python interfaces</w:t>
+        <w:t>Support multi-vehicle routing (car, bike, foot, etc.)</w:t>
       </w:r>
     </w:p>
     <w:p>
@@ -735,7 +761,7 @@
           <w:sz w:val="24"/>
           <w:szCs w:val="24"/>
         </w:rPr>
-        <w:t>Support multi-vehicle routing (car, bike, foot, etc.)</w:t>
+        <w:t>Offer advanced route statistics (elevation, distance, duration)</w:t>
       </w:r>
     </w:p>
     <w:p>
@@ -760,7 +786,7 @@
           <w:sz w:val="24"/>
           <w:szCs w:val="24"/>
         </w:rPr>
-        <w:t>Offer advanced route statistics (elevation, distance, duration)</w:t>
+        <w:t>Provide developers with an API and Python module for custom integration</w:t>
       </w:r>
     </w:p>
     <w:p>
@@ -785,31 +811,6 @@
           <w:sz w:val="24"/>
           <w:szCs w:val="24"/>
         </w:rPr>
-        <w:t>Provide developers with an API and Python module for custom integration</w:t>
-      </w:r>
-    </w:p>
-    <w:p>
-      <w:pPr>
-        <w:pStyle w:val="TextBody"/>
-        <w:numPr>
-          <w:ilvl w:val="0"/>
-          <w:numId w:val="21"/>
-        </w:numPr>
-        <w:tabs>
-          <w:tab w:val="clear" w:pos="720"/>
-          <w:tab w:val="left" w:pos="0" w:leader="none"/>
-        </w:tabs>
-        <w:ind w:left="720" w:hanging="283"/>
-        <w:rPr>
-          <w:sz w:val="24"/>
-          <w:szCs w:val="24"/>
-        </w:rPr>
-      </w:pPr>
-      <w:r>
-        <w:rPr>
-          <w:sz w:val="24"/>
-          <w:szCs w:val="24"/>
-        </w:rPr>
         <w:t>Handle errors and API limits gracefully for real-world reliability</w:t>
       </w:r>
     </w:p>
@@ -827,7 +828,7 @@
         <w:pStyle w:val="ListParagraph"/>
         <w:numPr>
           <w:ilvl w:val="0"/>
-          <w:numId w:val="4"/>
+          <w:numId w:val="3"/>
         </w:numPr>
         <w:rPr>
           <w:b/>
@@ -874,14 +875,14 @@
         <w:tblLook w:firstRow="1" w:noVBand="1" w:lastRow="0" w:firstColumn="1" w:lastColumn="0" w:noHBand="0" w:val="04a0"/>
       </w:tblPr>
       <w:tblGrid>
-        <w:gridCol w:w="2329"/>
-        <w:gridCol w:w="7175"/>
+        <w:gridCol w:w="2328"/>
+        <w:gridCol w:w="7176"/>
       </w:tblGrid>
       <w:tr>
         <w:trPr/>
         <w:tc>
           <w:tcPr>
-            <w:tcW w:w="2329" w:type="dxa"/>
+            <w:tcW w:w="2328" w:type="dxa"/>
             <w:tcBorders/>
             <w:shd w:fill="auto" w:val="clear"/>
           </w:tcPr>
@@ -898,7 +899,7 @@
         </w:tc>
         <w:tc>
           <w:tcPr>
-            <w:tcW w:w="7175" w:type="dxa"/>
+            <w:tcW w:w="7176" w:type="dxa"/>
             <w:tcBorders/>
             <w:shd w:fill="auto" w:val="clear"/>
           </w:tcPr>
@@ -920,7 +921,7 @@
         </w:trPr>
         <w:tc>
           <w:tcPr>
-            <w:tcW w:w="2329" w:type="dxa"/>
+            <w:tcW w:w="2328" w:type="dxa"/>
             <w:tcBorders/>
             <w:shd w:fill="auto" w:val="clear"/>
           </w:tcPr>
@@ -947,12 +948,7 @@
           <w:p>
             <w:pPr>
               <w:pStyle w:val="Normal"/>
-              <w:rPr>
-                <w:rFonts w:ascii="Times New Roman" w:hAnsi="Times New Roman" w:eastAsia="Times New Roman"/>
-                <w:sz w:val="24"/>
-                <w:szCs w:val="24"/>
-                <w:lang w:val="en-KR" w:eastAsia="ko-KR"/>
-              </w:rPr>
+              <w:rPr/>
             </w:pPr>
             <w:r>
               <w:rPr>
@@ -964,13 +960,6 @@
               <w:t>Khursanov Nazarbek</w:t>
             </w:r>
           </w:p>
-        </w:tc>
-        <w:tc>
-          <w:tcPr>
-            <w:tcW w:w="7175" w:type="dxa"/>
-            <w:tcBorders/>
-            <w:shd w:fill="auto" w:val="clear"/>
-          </w:tcPr>
           <w:p>
             <w:pPr>
               <w:pStyle w:val="Normal"/>
@@ -978,11 +967,38 @@
             </w:pPr>
             <w:r>
               <w:rPr>
-                <w:color w:val="000000"/>
+                <w:rFonts w:eastAsia="Times New Roman"/>
+                <w:sz w:val="24"/>
+                <w:szCs w:val="24"/>
+                <w:lang w:val="en-KR" w:eastAsia="ko-KR"/>
               </w:rPr>
-              <w:t>Developer – Python, REST APIs, GitHub, Documentation</w:t>
+              <w:t>Akylova Adinai</w:t>
             </w:r>
           </w:p>
+          <w:p>
+            <w:pPr>
+              <w:pStyle w:val="Normal"/>
+              <w:rPr>
+                <w:lang w:val="en-CA"/>
+              </w:rPr>
+            </w:pPr>
+            <w:r>
+              <w:rPr>
+                <w:rFonts w:eastAsia="Times New Roman"/>
+                <w:sz w:val="24"/>
+                <w:szCs w:val="24"/>
+                <w:lang w:val="en-CA" w:eastAsia="ko-KR"/>
+              </w:rPr>
+              <w:t>Kerimaliev Eldar</w:t>
+            </w:r>
+          </w:p>
+        </w:tc>
+        <w:tc>
+          <w:tcPr>
+            <w:tcW w:w="7176" w:type="dxa"/>
+            <w:tcBorders/>
+            <w:shd w:fill="auto" w:val="clear"/>
+          </w:tcPr>
           <w:p>
             <w:pPr>
               <w:pStyle w:val="Normal"/>
@@ -997,8 +1013,68 @@
             <w:r>
               <w:rPr>
                 <w:color w:val="000000"/>
+                <w:lang w:val="en-CA"/>
               </w:rPr>
               <w:t>PPT</w:t>
+            </w:r>
+          </w:p>
+          <w:p>
+            <w:pPr>
+              <w:pStyle w:val="Normal"/>
+              <w:rPr/>
+            </w:pPr>
+            <w:r>
+              <w:rPr>
+                <w:color w:val="000000"/>
+              </w:rPr>
+              <w:t>Developer – Python, REST APIs, GitHub, Documentation, PPT</w:t>
+            </w:r>
+          </w:p>
+          <w:p>
+            <w:pPr>
+              <w:pStyle w:val="Normal"/>
+              <w:rPr/>
+            </w:pPr>
+            <w:r>
+              <w:rPr>
+                <w:color w:val="000000"/>
+              </w:rPr>
+              <w:t>Developer – Python, REST APIs, GitHub, Documentation</w:t>
+            </w:r>
+            <w:r>
+              <w:rPr>
+                <w:color w:val="000000"/>
+                <w:lang w:val="ru-RU"/>
+              </w:rPr>
+              <w:t xml:space="preserve">, </w:t>
+            </w:r>
+            <w:r>
+              <w:rPr>
+                <w:color w:val="000000"/>
+                <w:lang w:val="en-CA"/>
+              </w:rPr>
+              <w:t>PPT</w:t>
+            </w:r>
+          </w:p>
+          <w:p>
+            <w:pPr>
+              <w:pStyle w:val="Normal"/>
+              <w:rPr/>
+            </w:pPr>
+            <w:r>
+              <w:rPr>
+                <w:color w:val="000000"/>
+              </w:rPr>
+              <w:t>Developer – Python, REST APIs, GitHub, Documentation, PPT</w:t>
+            </w:r>
+          </w:p>
+          <w:p>
+            <w:pPr>
+              <w:pStyle w:val="Normal"/>
+              <w:rPr/>
+            </w:pPr>
+            <w:r>
+              <w:rPr/>
             </w:r>
           </w:p>
         </w:tc>
@@ -1038,7 +1114,7 @@
         <w:pStyle w:val="ListParagraph"/>
         <w:numPr>
           <w:ilvl w:val="0"/>
-          <w:numId w:val="4"/>
+          <w:numId w:val="3"/>
         </w:numPr>
         <w:rPr>
           <w:b/>
@@ -1083,7 +1159,7 @@
         <w:pStyle w:val="ListParagraph"/>
         <w:numPr>
           <w:ilvl w:val="0"/>
-          <w:numId w:val="4"/>
+          <w:numId w:val="3"/>
         </w:numPr>
         <w:rPr/>
       </w:pPr>
@@ -1098,7 +1174,7 @@
     <w:p>
       <w:pPr>
         <w:pStyle w:val="ListParagraph"/>
-        <w:ind w:hanging="0"/>
+        <w:ind w:left="720" w:hanging="0"/>
         <w:rPr>
           <w:b/>
           <w:b/>
@@ -1106,7 +1182,10 @@
         </w:rPr>
       </w:pPr>
       <w:r>
-        <w:rPr/>
+        <w:rPr>
+          <w:b/>
+          <w:bCs/>
+        </w:rPr>
       </w:r>
     </w:p>
     <w:p>
@@ -1144,7 +1223,7 @@
         <w:pStyle w:val="ListParagraph"/>
         <w:numPr>
           <w:ilvl w:val="0"/>
-          <w:numId w:val="4"/>
+          <w:numId w:val="3"/>
         </w:numPr>
         <w:rPr/>
       </w:pPr>
@@ -1202,7 +1281,7 @@
         <w:pStyle w:val="TextBody"/>
         <w:numPr>
           <w:ilvl w:val="0"/>
-          <w:numId w:val="15"/>
+          <w:numId w:val="14"/>
         </w:numPr>
         <w:tabs>
           <w:tab w:val="clear" w:pos="720"/>
@@ -1221,7 +1300,7 @@
         <w:pStyle w:val="TextBody"/>
         <w:numPr>
           <w:ilvl w:val="1"/>
-          <w:numId w:val="15"/>
+          <w:numId w:val="14"/>
         </w:numPr>
         <w:tabs>
           <w:tab w:val="clear" w:pos="720"/>
@@ -1300,7 +1379,7 @@
         <w:pStyle w:val="TextBody"/>
         <w:numPr>
           <w:ilvl w:val="0"/>
-          <w:numId w:val="16"/>
+          <w:numId w:val="15"/>
         </w:numPr>
         <w:tabs>
           <w:tab w:val="clear" w:pos="720"/>
@@ -1319,7 +1398,7 @@
         <w:pStyle w:val="TextBody"/>
         <w:numPr>
           <w:ilvl w:val="0"/>
-          <w:numId w:val="16"/>
+          <w:numId w:val="15"/>
         </w:numPr>
         <w:tabs>
           <w:tab w:val="clear" w:pos="720"/>
@@ -1366,7 +1445,7 @@
         <w:pStyle w:val="TextBody"/>
         <w:numPr>
           <w:ilvl w:val="0"/>
-          <w:numId w:val="17"/>
+          <w:numId w:val="16"/>
         </w:numPr>
         <w:tabs>
           <w:tab w:val="clear" w:pos="720"/>
@@ -1391,7 +1470,7 @@
         <w:pStyle w:val="TextBody"/>
         <w:numPr>
           <w:ilvl w:val="0"/>
-          <w:numId w:val="17"/>
+          <w:numId w:val="16"/>
         </w:numPr>
         <w:tabs>
           <w:tab w:val="clear" w:pos="720"/>
@@ -1416,7 +1495,7 @@
         <w:pStyle w:val="TextBody"/>
         <w:numPr>
           <w:ilvl w:val="0"/>
-          <w:numId w:val="17"/>
+          <w:numId w:val="16"/>
         </w:numPr>
         <w:tabs>
           <w:tab w:val="clear" w:pos="720"/>
@@ -1487,7 +1566,7 @@
         <w:pStyle w:val="ListParagraph"/>
         <w:numPr>
           <w:ilvl w:val="0"/>
-          <w:numId w:val="3"/>
+          <w:numId w:val="2"/>
         </w:numPr>
         <w:rPr/>
       </w:pPr>
@@ -1501,7 +1580,7 @@
         <w:pStyle w:val="ListParagraph"/>
         <w:numPr>
           <w:ilvl w:val="0"/>
-          <w:numId w:val="3"/>
+          <w:numId w:val="2"/>
         </w:numPr>
         <w:rPr/>
       </w:pPr>
@@ -1515,7 +1594,7 @@
         <w:pStyle w:val="ListParagraph"/>
         <w:numPr>
           <w:ilvl w:val="0"/>
-          <w:numId w:val="3"/>
+          <w:numId w:val="2"/>
         </w:numPr>
         <w:rPr/>
       </w:pPr>
@@ -1529,7 +1608,7 @@
         <w:pStyle w:val="ListParagraph"/>
         <w:numPr>
           <w:ilvl w:val="0"/>
-          <w:numId w:val="3"/>
+          <w:numId w:val="2"/>
         </w:numPr>
         <w:rPr/>
       </w:pPr>
@@ -1543,7 +1622,7 @@
         <w:pStyle w:val="ListParagraph"/>
         <w:numPr>
           <w:ilvl w:val="0"/>
-          <w:numId w:val="3"/>
+          <w:numId w:val="2"/>
         </w:numPr>
         <w:rPr/>
       </w:pPr>
@@ -1557,7 +1636,7 @@
         <w:pStyle w:val="ListParagraph"/>
         <w:numPr>
           <w:ilvl w:val="0"/>
-          <w:numId w:val="3"/>
+          <w:numId w:val="2"/>
         </w:numPr>
         <w:rPr/>
       </w:pPr>
@@ -1868,7 +1947,7 @@
   <w:sdt>
     <w:sdtPr>
       <w:text/>
-      <w:id w:val="1404281101"/>
+      <w:id w:val="2115831340"/>
       <w:dataBinding w:prefixMappings="xmlns:ns0='http://purl.org/dc/elements/1.1/' xmlns:ns1='http://schemas.openxmlformats.org/package/2006/metadata/core-properties' " w:xpath="/ns1:coreProperties[1]/ns0:title[1]" w:storeItemID="{6C3C8BC8-F283-45AE-878A-BAB7291924A1}"/>
       <w:alias w:val="Title"/>
     </w:sdtPr>
@@ -2041,310 +2120,357 @@
     <w:lvl w:ilvl="0">
       <w:start w:val="1"/>
       <w:numFmt w:val="bullet"/>
+      <w:lvlText w:val=""/>
+      <w:lvlJc w:val="left"/>
+      <w:pPr>
+        <w:ind w:left="720" w:hanging="360"/>
+      </w:pPr>
+      <w:rPr>
+        <w:rFonts w:ascii="Symbol" w:hAnsi="Symbol" w:cs="Symbol" w:hint="default"/>
+        <w:rFonts w:cs="Symbol"/>
+      </w:rPr>
+    </w:lvl>
+    <w:lvl w:ilvl="1">
+      <w:start w:val="1"/>
+      <w:numFmt w:val="bullet"/>
       <w:lvlText w:val="o"/>
       <w:lvlJc w:val="left"/>
       <w:pPr>
-        <w:ind w:left="720" w:hanging="360"/>
+        <w:ind w:left="1440" w:hanging="360"/>
       </w:pPr>
       <w:rPr>
         <w:rFonts w:ascii="Courier New" w:hAnsi="Courier New" w:cs="Courier New" w:hint="default"/>
         <w:rFonts w:cs="Courier New"/>
       </w:rPr>
     </w:lvl>
-    <w:lvl w:ilvl="1">
+    <w:lvl w:ilvl="2">
+      <w:start w:val="1"/>
+      <w:numFmt w:val="bullet"/>
+      <w:lvlText w:val=""/>
+      <w:lvlJc w:val="left"/>
+      <w:pPr>
+        <w:ind w:left="2160" w:hanging="360"/>
+      </w:pPr>
+      <w:rPr>
+        <w:rFonts w:ascii="Wingdings" w:hAnsi="Wingdings" w:cs="Wingdings" w:hint="default"/>
+        <w:rFonts w:cs="Wingdings"/>
+      </w:rPr>
+    </w:lvl>
+    <w:lvl w:ilvl="3">
+      <w:start w:val="1"/>
+      <w:numFmt w:val="bullet"/>
+      <w:lvlText w:val=""/>
+      <w:lvlJc w:val="left"/>
+      <w:pPr>
+        <w:ind w:left="2880" w:hanging="360"/>
+      </w:pPr>
+      <w:rPr>
+        <w:rFonts w:ascii="Symbol" w:hAnsi="Symbol" w:cs="Symbol" w:hint="default"/>
+        <w:rFonts w:cs="Symbol"/>
+      </w:rPr>
+    </w:lvl>
+    <w:lvl w:ilvl="4">
       <w:start w:val="1"/>
       <w:numFmt w:val="bullet"/>
       <w:lvlText w:val="o"/>
       <w:lvlJc w:val="left"/>
       <w:pPr>
-        <w:ind w:left="1440" w:hanging="360"/>
+        <w:ind w:left="3600" w:hanging="360"/>
       </w:pPr>
       <w:rPr>
         <w:rFonts w:ascii="Courier New" w:hAnsi="Courier New" w:cs="Courier New" w:hint="default"/>
         <w:rFonts w:cs="Courier New"/>
       </w:rPr>
     </w:lvl>
-    <w:lvl w:ilvl="2">
+    <w:lvl w:ilvl="5">
       <w:start w:val="1"/>
       <w:numFmt w:val="bullet"/>
       <w:lvlText w:val=""/>
       <w:lvlJc w:val="left"/>
       <w:pPr>
-        <w:ind w:left="2160" w:hanging="360"/>
+        <w:ind w:left="4320" w:hanging="360"/>
       </w:pPr>
       <w:rPr>
         <w:rFonts w:ascii="Wingdings" w:hAnsi="Wingdings" w:cs="Wingdings" w:hint="default"/>
-      </w:rPr>
-    </w:lvl>
-    <w:lvl w:ilvl="3">
+        <w:rFonts w:cs="Wingdings"/>
+      </w:rPr>
+    </w:lvl>
+    <w:lvl w:ilvl="6">
       <w:start w:val="1"/>
       <w:numFmt w:val="bullet"/>
       <w:lvlText w:val=""/>
       <w:lvlJc w:val="left"/>
       <w:pPr>
-        <w:ind w:left="2880" w:hanging="360"/>
+        <w:ind w:left="5040" w:hanging="360"/>
       </w:pPr>
       <w:rPr>
         <w:rFonts w:ascii="Symbol" w:hAnsi="Symbol" w:cs="Symbol" w:hint="default"/>
-      </w:rPr>
-    </w:lvl>
-    <w:lvl w:ilvl="4">
+        <w:rFonts w:cs="Symbol"/>
+      </w:rPr>
+    </w:lvl>
+    <w:lvl w:ilvl="7">
       <w:start w:val="1"/>
       <w:numFmt w:val="bullet"/>
       <w:lvlText w:val="o"/>
       <w:lvlJc w:val="left"/>
       <w:pPr>
-        <w:ind w:left="3600" w:hanging="360"/>
+        <w:ind w:left="5760" w:hanging="360"/>
       </w:pPr>
       <w:rPr>
         <w:rFonts w:ascii="Courier New" w:hAnsi="Courier New" w:cs="Courier New" w:hint="default"/>
         <w:rFonts w:cs="Courier New"/>
       </w:rPr>
     </w:lvl>
-    <w:lvl w:ilvl="5">
+    <w:lvl w:ilvl="8">
       <w:start w:val="1"/>
       <w:numFmt w:val="bullet"/>
       <w:lvlText w:val=""/>
       <w:lvlJc w:val="left"/>
       <w:pPr>
-        <w:ind w:left="4320" w:hanging="360"/>
+        <w:ind w:left="6480" w:hanging="360"/>
       </w:pPr>
       <w:rPr>
         <w:rFonts w:ascii="Wingdings" w:hAnsi="Wingdings" w:cs="Wingdings" w:hint="default"/>
-      </w:rPr>
-    </w:lvl>
-    <w:lvl w:ilvl="6">
-      <w:start w:val="1"/>
-      <w:numFmt w:val="bullet"/>
-      <w:lvlText w:val=""/>
-      <w:lvlJc w:val="left"/>
-      <w:pPr>
-        <w:ind w:left="5040" w:hanging="360"/>
-      </w:pPr>
-      <w:rPr>
-        <w:rFonts w:ascii="Symbol" w:hAnsi="Symbol" w:cs="Symbol" w:hint="default"/>
-      </w:rPr>
-    </w:lvl>
-    <w:lvl w:ilvl="7">
-      <w:start w:val="1"/>
-      <w:numFmt w:val="bullet"/>
-      <w:lvlText w:val="o"/>
-      <w:lvlJc w:val="left"/>
-      <w:pPr>
-        <w:ind w:left="5760" w:hanging="360"/>
-      </w:pPr>
-      <w:rPr>
-        <w:rFonts w:ascii="Courier New" w:hAnsi="Courier New" w:cs="Courier New" w:hint="default"/>
-        <w:rFonts w:cs="Courier New"/>
-      </w:rPr>
-    </w:lvl>
-    <w:lvl w:ilvl="8">
-      <w:start w:val="1"/>
-      <w:numFmt w:val="bullet"/>
-      <w:lvlText w:val=""/>
-      <w:lvlJc w:val="left"/>
-      <w:pPr>
-        <w:ind w:left="6480" w:hanging="360"/>
-      </w:pPr>
-      <w:rPr>
-        <w:rFonts w:ascii="Wingdings" w:hAnsi="Wingdings" w:cs="Wingdings" w:hint="default"/>
+        <w:rFonts w:cs="Wingdings"/>
       </w:rPr>
     </w:lvl>
   </w:abstractNum>
   <w:abstractNum w:abstractNumId="3">
     <w:lvl w:ilvl="0">
       <w:start w:val="1"/>
-      <w:numFmt w:val="bullet"/>
-      <w:lvlText w:val=""/>
+      <w:numFmt w:val="decimal"/>
+      <w:lvlText w:val="%1."/>
       <w:lvlJc w:val="left"/>
       <w:pPr>
         <w:ind w:left="720" w:hanging="360"/>
       </w:pPr>
-      <w:rPr>
-        <w:rFonts w:ascii="Symbol" w:hAnsi="Symbol" w:cs="Symbol" w:hint="default"/>
-      </w:rPr>
     </w:lvl>
     <w:lvl w:ilvl="1">
       <w:start w:val="1"/>
-      <w:numFmt w:val="bullet"/>
-      <w:lvlText w:val="o"/>
+      <w:numFmt w:val="lowerLetter"/>
+      <w:lvlText w:val="%2."/>
       <w:lvlJc w:val="left"/>
       <w:pPr>
         <w:ind w:left="1440" w:hanging="360"/>
       </w:pPr>
-      <w:rPr>
-        <w:rFonts w:ascii="Courier New" w:hAnsi="Courier New" w:cs="Courier New" w:hint="default"/>
-        <w:rFonts w:cs="Courier New"/>
-      </w:rPr>
     </w:lvl>
     <w:lvl w:ilvl="2">
       <w:start w:val="1"/>
-      <w:numFmt w:val="bullet"/>
-      <w:lvlText w:val=""/>
-      <w:lvlJc w:val="left"/>
-      <w:pPr>
-        <w:ind w:left="2160" w:hanging="360"/>
-      </w:pPr>
-      <w:rPr>
-        <w:rFonts w:ascii="Wingdings" w:hAnsi="Wingdings" w:cs="Wingdings" w:hint="default"/>
-      </w:rPr>
+      <w:numFmt w:val="lowerRoman"/>
+      <w:lvlText w:val="%3."/>
+      <w:lvlJc w:val="right"/>
+      <w:pPr>
+        <w:ind w:left="2160" w:hanging="180"/>
+      </w:pPr>
     </w:lvl>
     <w:lvl w:ilvl="3">
       <w:start w:val="1"/>
-      <w:numFmt w:val="bullet"/>
-      <w:lvlText w:val=""/>
+      <w:numFmt w:val="decimal"/>
+      <w:lvlText w:val="%4."/>
       <w:lvlJc w:val="left"/>
       <w:pPr>
         <w:ind w:left="2880" w:hanging="360"/>
       </w:pPr>
-      <w:rPr>
-        <w:rFonts w:ascii="Symbol" w:hAnsi="Symbol" w:cs="Symbol" w:hint="default"/>
-      </w:rPr>
     </w:lvl>
     <w:lvl w:ilvl="4">
       <w:start w:val="1"/>
-      <w:numFmt w:val="bullet"/>
-      <w:lvlText w:val="o"/>
+      <w:numFmt w:val="lowerLetter"/>
+      <w:lvlText w:val="%5."/>
       <w:lvlJc w:val="left"/>
       <w:pPr>
         <w:ind w:left="3600" w:hanging="360"/>
       </w:pPr>
-      <w:rPr>
-        <w:rFonts w:ascii="Courier New" w:hAnsi="Courier New" w:cs="Courier New" w:hint="default"/>
-        <w:rFonts w:cs="Courier New"/>
-      </w:rPr>
     </w:lvl>
     <w:lvl w:ilvl="5">
       <w:start w:val="1"/>
-      <w:numFmt w:val="bullet"/>
-      <w:lvlText w:val=""/>
-      <w:lvlJc w:val="left"/>
-      <w:pPr>
-        <w:ind w:left="4320" w:hanging="360"/>
-      </w:pPr>
-      <w:rPr>
-        <w:rFonts w:ascii="Wingdings" w:hAnsi="Wingdings" w:cs="Wingdings" w:hint="default"/>
-      </w:rPr>
+      <w:numFmt w:val="lowerRoman"/>
+      <w:lvlText w:val="%6."/>
+      <w:lvlJc w:val="right"/>
+      <w:pPr>
+        <w:ind w:left="4320" w:hanging="180"/>
+      </w:pPr>
     </w:lvl>
     <w:lvl w:ilvl="6">
       <w:start w:val="1"/>
-      <w:numFmt w:val="bullet"/>
-      <w:lvlText w:val=""/>
+      <w:numFmt w:val="decimal"/>
+      <w:lvlText w:val="%7."/>
       <w:lvlJc w:val="left"/>
       <w:pPr>
         <w:ind w:left="5040" w:hanging="360"/>
       </w:pPr>
-      <w:rPr>
-        <w:rFonts w:ascii="Symbol" w:hAnsi="Symbol" w:cs="Symbol" w:hint="default"/>
-      </w:rPr>
     </w:lvl>
     <w:lvl w:ilvl="7">
       <w:start w:val="1"/>
-      <w:numFmt w:val="bullet"/>
-      <w:lvlText w:val="o"/>
+      <w:numFmt w:val="lowerLetter"/>
+      <w:lvlText w:val="%8."/>
       <w:lvlJc w:val="left"/>
       <w:pPr>
         <w:ind w:left="5760" w:hanging="360"/>
       </w:pPr>
-      <w:rPr>
-        <w:rFonts w:ascii="Courier New" w:hAnsi="Courier New" w:cs="Courier New" w:hint="default"/>
-        <w:rFonts w:cs="Courier New"/>
-      </w:rPr>
     </w:lvl>
     <w:lvl w:ilvl="8">
       <w:start w:val="1"/>
-      <w:numFmt w:val="bullet"/>
-      <w:lvlText w:val=""/>
-      <w:lvlJc w:val="left"/>
-      <w:pPr>
-        <w:ind w:left="6480" w:hanging="360"/>
-      </w:pPr>
-      <w:rPr>
-        <w:rFonts w:ascii="Wingdings" w:hAnsi="Wingdings" w:cs="Wingdings" w:hint="default"/>
-      </w:rPr>
+      <w:numFmt w:val="lowerRoman"/>
+      <w:lvlText w:val="%9."/>
+      <w:lvlJc w:val="right"/>
+      <w:pPr>
+        <w:ind w:left="6480" w:hanging="180"/>
+      </w:pPr>
     </w:lvl>
   </w:abstractNum>
   <w:abstractNum w:abstractNumId="4">
     <w:lvl w:ilvl="0">
       <w:start w:val="1"/>
-      <w:numFmt w:val="decimal"/>
-      <w:lvlText w:val="%1."/>
-      <w:lvlJc w:val="left"/>
-      <w:pPr>
+      <w:numFmt w:val="bullet"/>
+      <w:lvlText w:val=""/>
+      <w:lvlJc w:val="left"/>
+      <w:pPr>
+        <w:tabs>
+          <w:tab w:val="num" w:pos="720"/>
+        </w:tabs>
         <w:ind w:left="720" w:hanging="360"/>
       </w:pPr>
+      <w:rPr>
+        <w:rFonts w:ascii="Symbol" w:hAnsi="Symbol" w:cs="Symbol" w:hint="default"/>
+        <w:sz w:val="24"/>
+        <w:rFonts w:cs="Symbol"/>
+      </w:rPr>
     </w:lvl>
     <w:lvl w:ilvl="1">
       <w:start w:val="1"/>
-      <w:numFmt w:val="lowerLetter"/>
-      <w:lvlText w:val="%2."/>
-      <w:lvlJc w:val="left"/>
-      <w:pPr>
+      <w:numFmt w:val="bullet"/>
+      <w:lvlText w:val="o"/>
+      <w:lvlJc w:val="left"/>
+      <w:pPr>
+        <w:tabs>
+          <w:tab w:val="num" w:pos="1440"/>
+        </w:tabs>
         <w:ind w:left="1440" w:hanging="360"/>
       </w:pPr>
+      <w:rPr>
+        <w:rFonts w:ascii="Courier New" w:hAnsi="Courier New" w:cs="Courier New" w:hint="default"/>
+        <w:sz w:val="20"/>
+        <w:rFonts w:cs="Courier New"/>
+      </w:rPr>
     </w:lvl>
     <w:lvl w:ilvl="2">
       <w:start w:val="1"/>
-      <w:numFmt w:val="lowerRoman"/>
-      <w:lvlText w:val="%3."/>
-      <w:lvlJc w:val="right"/>
-      <w:pPr>
-        <w:ind w:left="2160" w:hanging="180"/>
-      </w:pPr>
+      <w:numFmt w:val="bullet"/>
+      <w:lvlText w:val=""/>
+      <w:lvlJc w:val="left"/>
+      <w:pPr>
+        <w:tabs>
+          <w:tab w:val="num" w:pos="2160"/>
+        </w:tabs>
+        <w:ind w:left="2160" w:hanging="360"/>
+      </w:pPr>
+      <w:rPr>
+        <w:rFonts w:ascii="Wingdings" w:hAnsi="Wingdings" w:cs="Wingdings" w:hint="default"/>
+        <w:sz w:val="20"/>
+        <w:rFonts w:cs="Wingdings"/>
+      </w:rPr>
     </w:lvl>
     <w:lvl w:ilvl="3">
       <w:start w:val="1"/>
-      <w:numFmt w:val="decimal"/>
-      <w:lvlText w:val="%4."/>
-      <w:lvlJc w:val="left"/>
-      <w:pPr>
+      <w:numFmt w:val="bullet"/>
+      <w:lvlText w:val=""/>
+      <w:lvlJc w:val="left"/>
+      <w:pPr>
+        <w:tabs>
+          <w:tab w:val="num" w:pos="2880"/>
+        </w:tabs>
         <w:ind w:left="2880" w:hanging="360"/>
       </w:pPr>
+      <w:rPr>
+        <w:rFonts w:ascii="Wingdings" w:hAnsi="Wingdings" w:cs="Wingdings" w:hint="default"/>
+        <w:sz w:val="20"/>
+        <w:rFonts w:cs="Wingdings"/>
+      </w:rPr>
     </w:lvl>
     <w:lvl w:ilvl="4">
       <w:start w:val="1"/>
-      <w:numFmt w:val="lowerLetter"/>
-      <w:lvlText w:val="%5."/>
-      <w:lvlJc w:val="left"/>
-      <w:pPr>
+      <w:numFmt w:val="bullet"/>
+      <w:lvlText w:val=""/>
+      <w:lvlJc w:val="left"/>
+      <w:pPr>
+        <w:tabs>
+          <w:tab w:val="num" w:pos="3600"/>
+        </w:tabs>
         <w:ind w:left="3600" w:hanging="360"/>
       </w:pPr>
+      <w:rPr>
+        <w:rFonts w:ascii="Wingdings" w:hAnsi="Wingdings" w:cs="Wingdings" w:hint="default"/>
+        <w:sz w:val="20"/>
+        <w:rFonts w:cs="Wingdings"/>
+      </w:rPr>
     </w:lvl>
     <w:lvl w:ilvl="5">
       <w:start w:val="1"/>
-      <w:numFmt w:val="lowerRoman"/>
-      <w:lvlText w:val="%6."/>
-      <w:lvlJc w:val="right"/>
-      <w:pPr>
-        <w:ind w:left="4320" w:hanging="180"/>
-      </w:pPr>
+      <w:numFmt w:val="bullet"/>
+      <w:lvlText w:val=""/>
+      <w:lvlJc w:val="left"/>
+      <w:pPr>
+        <w:tabs>
+          <w:tab w:val="num" w:pos="4320"/>
+        </w:tabs>
+        <w:ind w:left="4320" w:hanging="360"/>
+      </w:pPr>
+      <w:rPr>
+        <w:rFonts w:ascii="Wingdings" w:hAnsi="Wingdings" w:cs="Wingdings" w:hint="default"/>
+        <w:sz w:val="20"/>
+        <w:rFonts w:cs="Wingdings"/>
+      </w:rPr>
     </w:lvl>
     <w:lvl w:ilvl="6">
       <w:start w:val="1"/>
-      <w:numFmt w:val="decimal"/>
-      <w:lvlText w:val="%7."/>
-      <w:lvlJc w:val="left"/>
-      <w:pPr>
+      <w:numFmt w:val="bullet"/>
+      <w:lvlText w:val=""/>
+      <w:lvlJc w:val="left"/>
+      <w:pPr>
+        <w:tabs>
+          <w:tab w:val="num" w:pos="5040"/>
+        </w:tabs>
         <w:ind w:left="5040" w:hanging="360"/>
       </w:pPr>
+      <w:rPr>
+        <w:rFonts w:ascii="Wingdings" w:hAnsi="Wingdings" w:cs="Wingdings" w:hint="default"/>
+        <w:sz w:val="20"/>
+        <w:rFonts w:cs="Wingdings"/>
+      </w:rPr>
     </w:lvl>
     <w:lvl w:ilvl="7">
       <w:start w:val="1"/>
-      <w:numFmt w:val="lowerLetter"/>
-      <w:lvlText w:val="%8."/>
-      <w:lvlJc w:val="left"/>
-      <w:pPr>
+      <w:numFmt w:val="bullet"/>
+      <w:lvlText w:val=""/>
+      <w:lvlJc w:val="left"/>
+      <w:pPr>
+        <w:tabs>
+          <w:tab w:val="num" w:pos="5760"/>
+        </w:tabs>
         <w:ind w:left="5760" w:hanging="360"/>
       </w:pPr>
+      <w:rPr>
+        <w:rFonts w:ascii="Wingdings" w:hAnsi="Wingdings" w:cs="Wingdings" w:hint="default"/>
+        <w:sz w:val="20"/>
+        <w:rFonts w:cs="Wingdings"/>
+      </w:rPr>
     </w:lvl>
     <w:lvl w:ilvl="8">
       <w:start w:val="1"/>
-      <w:numFmt w:val="lowerRoman"/>
-      <w:lvlText w:val="%9."/>
-      <w:lvlJc w:val="right"/>
-      <w:pPr>
-        <w:ind w:left="6480" w:hanging="180"/>
-      </w:pPr>
+      <w:numFmt w:val="bullet"/>
+      <w:lvlText w:val=""/>
+      <w:lvlJc w:val="left"/>
+      <w:pPr>
+        <w:tabs>
+          <w:tab w:val="num" w:pos="6480"/>
+        </w:tabs>
+        <w:ind w:left="6480" w:hanging="360"/>
+      </w:pPr>
+      <w:rPr>
+        <w:rFonts w:ascii="Wingdings" w:hAnsi="Wingdings" w:cs="Wingdings" w:hint="default"/>
+        <w:sz w:val="20"/>
+        <w:rFonts w:cs="Wingdings"/>
+      </w:rPr>
     </w:lvl>
   </w:abstractNum>
   <w:abstractNum w:abstractNumId="5">
@@ -2355,141 +2481,142 @@
       <w:lvlJc w:val="left"/>
       <w:pPr>
         <w:tabs>
-          <w:tab w:val="num" w:pos="720"/>
-        </w:tabs>
-        <w:ind w:left="720" w:hanging="360"/>
+          <w:tab w:val="num" w:pos="707"/>
+        </w:tabs>
+        <w:ind w:left="707" w:hanging="283"/>
       </w:pPr>
       <w:rPr>
         <w:rFonts w:ascii="Symbol" w:hAnsi="Symbol" w:cs="Symbol" w:hint="default"/>
-        <w:sz w:val="20"/>
+        <w:sz w:val="24"/>
+        <w:rFonts w:cs="OpenSymbol"/>
       </w:rPr>
     </w:lvl>
     <w:lvl w:ilvl="1">
       <w:start w:val="1"/>
       <w:numFmt w:val="bullet"/>
-      <w:lvlText w:val="o"/>
-      <w:lvlJc w:val="left"/>
-      <w:pPr>
-        <w:tabs>
-          <w:tab w:val="num" w:pos="1440"/>
-        </w:tabs>
-        <w:ind w:left="1440" w:hanging="360"/>
-      </w:pPr>
-      <w:rPr>
-        <w:rFonts w:ascii="Courier New" w:hAnsi="Courier New" w:cs="Courier New" w:hint="default"/>
-        <w:sz w:val="20"/>
+      <w:lvlText w:val=""/>
+      <w:lvlJc w:val="left"/>
+      <w:pPr>
+        <w:tabs>
+          <w:tab w:val="num" w:pos="1414"/>
+        </w:tabs>
+        <w:ind w:left="1414" w:hanging="283"/>
+      </w:pPr>
+      <w:rPr>
+        <w:rFonts w:ascii="Symbol" w:hAnsi="Symbol" w:cs="Symbol" w:hint="default"/>
+        <w:rFonts w:cs="OpenSymbol"/>
       </w:rPr>
     </w:lvl>
     <w:lvl w:ilvl="2">
       <w:start w:val="1"/>
       <w:numFmt w:val="bullet"/>
-      <w:lvlText w:val=""/>
-      <w:lvlJc w:val="left"/>
-      <w:pPr>
-        <w:tabs>
-          <w:tab w:val="num" w:pos="2160"/>
-        </w:tabs>
-        <w:ind w:left="2160" w:hanging="360"/>
-      </w:pPr>
-      <w:rPr>
-        <w:rFonts w:ascii="Wingdings" w:hAnsi="Wingdings" w:cs="Wingdings" w:hint="default"/>
-        <w:sz w:val="20"/>
+      <w:lvlText w:val=""/>
+      <w:lvlJc w:val="left"/>
+      <w:pPr>
+        <w:tabs>
+          <w:tab w:val="num" w:pos="2121"/>
+        </w:tabs>
+        <w:ind w:left="2121" w:hanging="283"/>
+      </w:pPr>
+      <w:rPr>
+        <w:rFonts w:ascii="Symbol" w:hAnsi="Symbol" w:cs="Symbol" w:hint="default"/>
+        <w:rFonts w:cs="OpenSymbol"/>
       </w:rPr>
     </w:lvl>
     <w:lvl w:ilvl="3">
       <w:start w:val="1"/>
       <w:numFmt w:val="bullet"/>
-      <w:lvlText w:val=""/>
-      <w:lvlJc w:val="left"/>
-      <w:pPr>
-        <w:tabs>
-          <w:tab w:val="num" w:pos="2880"/>
-        </w:tabs>
-        <w:ind w:left="2880" w:hanging="360"/>
-      </w:pPr>
-      <w:rPr>
-        <w:rFonts w:ascii="Wingdings" w:hAnsi="Wingdings" w:cs="Wingdings" w:hint="default"/>
-        <w:sz w:val="20"/>
+      <w:lvlText w:val=""/>
+      <w:lvlJc w:val="left"/>
+      <w:pPr>
+        <w:tabs>
+          <w:tab w:val="num" w:pos="2828"/>
+        </w:tabs>
+        <w:ind w:left="2828" w:hanging="283"/>
+      </w:pPr>
+      <w:rPr>
+        <w:rFonts w:ascii="Symbol" w:hAnsi="Symbol" w:cs="Symbol" w:hint="default"/>
+        <w:rFonts w:cs="OpenSymbol"/>
       </w:rPr>
     </w:lvl>
     <w:lvl w:ilvl="4">
       <w:start w:val="1"/>
       <w:numFmt w:val="bullet"/>
-      <w:lvlText w:val=""/>
-      <w:lvlJc w:val="left"/>
-      <w:pPr>
-        <w:tabs>
-          <w:tab w:val="num" w:pos="3600"/>
-        </w:tabs>
-        <w:ind w:left="3600" w:hanging="360"/>
-      </w:pPr>
-      <w:rPr>
-        <w:rFonts w:ascii="Wingdings" w:hAnsi="Wingdings" w:cs="Wingdings" w:hint="default"/>
-        <w:sz w:val="20"/>
+      <w:lvlText w:val=""/>
+      <w:lvlJc w:val="left"/>
+      <w:pPr>
+        <w:tabs>
+          <w:tab w:val="num" w:pos="3535"/>
+        </w:tabs>
+        <w:ind w:left="3535" w:hanging="283"/>
+      </w:pPr>
+      <w:rPr>
+        <w:rFonts w:ascii="Symbol" w:hAnsi="Symbol" w:cs="Symbol" w:hint="default"/>
+        <w:rFonts w:cs="OpenSymbol"/>
       </w:rPr>
     </w:lvl>
     <w:lvl w:ilvl="5">
       <w:start w:val="1"/>
       <w:numFmt w:val="bullet"/>
-      <w:lvlText w:val=""/>
-      <w:lvlJc w:val="left"/>
-      <w:pPr>
-        <w:tabs>
-          <w:tab w:val="num" w:pos="4320"/>
-        </w:tabs>
-        <w:ind w:left="4320" w:hanging="360"/>
-      </w:pPr>
-      <w:rPr>
-        <w:rFonts w:ascii="Wingdings" w:hAnsi="Wingdings" w:cs="Wingdings" w:hint="default"/>
-        <w:sz w:val="20"/>
+      <w:lvlText w:val=""/>
+      <w:lvlJc w:val="left"/>
+      <w:pPr>
+        <w:tabs>
+          <w:tab w:val="num" w:pos="4242"/>
+        </w:tabs>
+        <w:ind w:left="4242" w:hanging="283"/>
+      </w:pPr>
+      <w:rPr>
+        <w:rFonts w:ascii="Symbol" w:hAnsi="Symbol" w:cs="Symbol" w:hint="default"/>
+        <w:rFonts w:cs="OpenSymbol"/>
       </w:rPr>
     </w:lvl>
     <w:lvl w:ilvl="6">
       <w:start w:val="1"/>
       <w:numFmt w:val="bullet"/>
-      <w:lvlText w:val=""/>
-      <w:lvlJc w:val="left"/>
-      <w:pPr>
-        <w:tabs>
-          <w:tab w:val="num" w:pos="5040"/>
-        </w:tabs>
-        <w:ind w:left="5040" w:hanging="360"/>
-      </w:pPr>
-      <w:rPr>
-        <w:rFonts w:ascii="Wingdings" w:hAnsi="Wingdings" w:cs="Wingdings" w:hint="default"/>
-        <w:sz w:val="20"/>
+      <w:lvlText w:val=""/>
+      <w:lvlJc w:val="left"/>
+      <w:pPr>
+        <w:tabs>
+          <w:tab w:val="num" w:pos="4949"/>
+        </w:tabs>
+        <w:ind w:left="4949" w:hanging="283"/>
+      </w:pPr>
+      <w:rPr>
+        <w:rFonts w:ascii="Symbol" w:hAnsi="Symbol" w:cs="Symbol" w:hint="default"/>
+        <w:rFonts w:cs="OpenSymbol"/>
       </w:rPr>
     </w:lvl>
     <w:lvl w:ilvl="7">
       <w:start w:val="1"/>
       <w:numFmt w:val="bullet"/>
-      <w:lvlText w:val=""/>
-      <w:lvlJc w:val="left"/>
-      <w:pPr>
-        <w:tabs>
-          <w:tab w:val="num" w:pos="5760"/>
-        </w:tabs>
-        <w:ind w:left="5760" w:hanging="360"/>
-      </w:pPr>
-      <w:rPr>
-        <w:rFonts w:ascii="Wingdings" w:hAnsi="Wingdings" w:cs="Wingdings" w:hint="default"/>
-        <w:sz w:val="20"/>
+      <w:lvlText w:val=""/>
+      <w:lvlJc w:val="left"/>
+      <w:pPr>
+        <w:tabs>
+          <w:tab w:val="num" w:pos="5656"/>
+        </w:tabs>
+        <w:ind w:left="5656" w:hanging="283"/>
+      </w:pPr>
+      <w:rPr>
+        <w:rFonts w:ascii="Symbol" w:hAnsi="Symbol" w:cs="Symbol" w:hint="default"/>
+        <w:rFonts w:cs="OpenSymbol"/>
       </w:rPr>
     </w:lvl>
     <w:lvl w:ilvl="8">
       <w:start w:val="1"/>
       <w:numFmt w:val="bullet"/>
-      <w:lvlText w:val=""/>
-      <w:lvlJc w:val="left"/>
-      <w:pPr>
-        <w:tabs>
-          <w:tab w:val="num" w:pos="6480"/>
-        </w:tabs>
-        <w:ind w:left="6480" w:hanging="360"/>
-      </w:pPr>
-      <w:rPr>
-        <w:rFonts w:ascii="Wingdings" w:hAnsi="Wingdings" w:cs="Wingdings" w:hint="default"/>
-        <w:sz w:val="20"/>
+      <w:lvlText w:val=""/>
+      <w:lvlJc w:val="left"/>
+      <w:pPr>
+        <w:tabs>
+          <w:tab w:val="num" w:pos="6363"/>
+        </w:tabs>
+        <w:ind w:left="6363" w:hanging="283"/>
+      </w:pPr>
+      <w:rPr>
+        <w:rFonts w:ascii="Symbol" w:hAnsi="Symbol" w:cs="Symbol" w:hint="default"/>
+        <w:rFonts w:cs="OpenSymbol"/>
       </w:rPr>
     </w:lvl>
   </w:abstractNum>
@@ -2501,140 +2628,141 @@
       <w:lvlJc w:val="left"/>
       <w:pPr>
         <w:tabs>
-          <w:tab w:val="num" w:pos="707"/>
-        </w:tabs>
-        <w:ind w:left="707" w:hanging="283"/>
+          <w:tab w:val="num" w:pos="720"/>
+        </w:tabs>
+        <w:ind w:left="720" w:hanging="360"/>
+      </w:pPr>
+      <w:rPr>
+        <w:rFonts w:ascii="Symbol" w:hAnsi="Symbol" w:cs="Symbol" w:hint="default"/>
+        <w:sz w:val="24"/>
+        <w:rFonts w:cs="OpenSymbol"/>
+      </w:rPr>
+    </w:lvl>
+    <w:lvl w:ilvl="1">
+      <w:start w:val="1"/>
+      <w:numFmt w:val="bullet"/>
+      <w:lvlText w:val="◦"/>
+      <w:lvlJc w:val="left"/>
+      <w:pPr>
+        <w:tabs>
+          <w:tab w:val="num" w:pos="1080"/>
+        </w:tabs>
+        <w:ind w:left="1080" w:hanging="360"/>
+      </w:pPr>
+      <w:rPr>
+        <w:rFonts w:ascii="OpenSymbol" w:hAnsi="OpenSymbol" w:cs="OpenSymbol" w:hint="default"/>
+        <w:rFonts w:cs="OpenSymbol"/>
+      </w:rPr>
+    </w:lvl>
+    <w:lvl w:ilvl="2">
+      <w:start w:val="1"/>
+      <w:numFmt w:val="bullet"/>
+      <w:lvlText w:val="▪"/>
+      <w:lvlJc w:val="left"/>
+      <w:pPr>
+        <w:tabs>
+          <w:tab w:val="num" w:pos="1440"/>
+        </w:tabs>
+        <w:ind w:left="1440" w:hanging="360"/>
+      </w:pPr>
+      <w:rPr>
+        <w:rFonts w:ascii="OpenSymbol" w:hAnsi="OpenSymbol" w:cs="OpenSymbol" w:hint="default"/>
+        <w:rFonts w:cs="OpenSymbol"/>
+      </w:rPr>
+    </w:lvl>
+    <w:lvl w:ilvl="3">
+      <w:start w:val="1"/>
+      <w:numFmt w:val="bullet"/>
+      <w:lvlText w:val=""/>
+      <w:lvlJc w:val="left"/>
+      <w:pPr>
+        <w:tabs>
+          <w:tab w:val="num" w:pos="1800"/>
+        </w:tabs>
+        <w:ind w:left="1800" w:hanging="360"/>
       </w:pPr>
       <w:rPr>
         <w:rFonts w:ascii="Symbol" w:hAnsi="Symbol" w:cs="Symbol" w:hint="default"/>
         <w:rFonts w:cs="OpenSymbol"/>
       </w:rPr>
     </w:lvl>
-    <w:lvl w:ilvl="1">
+    <w:lvl w:ilvl="4">
+      <w:start w:val="1"/>
+      <w:numFmt w:val="bullet"/>
+      <w:lvlText w:val="◦"/>
+      <w:lvlJc w:val="left"/>
+      <w:pPr>
+        <w:tabs>
+          <w:tab w:val="num" w:pos="2160"/>
+        </w:tabs>
+        <w:ind w:left="2160" w:hanging="360"/>
+      </w:pPr>
+      <w:rPr>
+        <w:rFonts w:ascii="OpenSymbol" w:hAnsi="OpenSymbol" w:cs="OpenSymbol" w:hint="default"/>
+        <w:rFonts w:cs="OpenSymbol"/>
+      </w:rPr>
+    </w:lvl>
+    <w:lvl w:ilvl="5">
+      <w:start w:val="1"/>
+      <w:numFmt w:val="bullet"/>
+      <w:lvlText w:val="▪"/>
+      <w:lvlJc w:val="left"/>
+      <w:pPr>
+        <w:tabs>
+          <w:tab w:val="num" w:pos="2520"/>
+        </w:tabs>
+        <w:ind w:left="2520" w:hanging="360"/>
+      </w:pPr>
+      <w:rPr>
+        <w:rFonts w:ascii="OpenSymbol" w:hAnsi="OpenSymbol" w:cs="OpenSymbol" w:hint="default"/>
+        <w:rFonts w:cs="OpenSymbol"/>
+      </w:rPr>
+    </w:lvl>
+    <w:lvl w:ilvl="6">
       <w:start w:val="1"/>
       <w:numFmt w:val="bullet"/>
       <w:lvlText w:val=""/>
       <w:lvlJc w:val="left"/>
       <w:pPr>
         <w:tabs>
-          <w:tab w:val="num" w:pos="1414"/>
-        </w:tabs>
-        <w:ind w:left="1414" w:hanging="283"/>
+          <w:tab w:val="num" w:pos="2880"/>
+        </w:tabs>
+        <w:ind w:left="2880" w:hanging="360"/>
       </w:pPr>
       <w:rPr>
         <w:rFonts w:ascii="Symbol" w:hAnsi="Symbol" w:cs="Symbol" w:hint="default"/>
         <w:rFonts w:cs="OpenSymbol"/>
       </w:rPr>
     </w:lvl>
-    <w:lvl w:ilvl="2">
+    <w:lvl w:ilvl="7">
       <w:start w:val="1"/>
       <w:numFmt w:val="bullet"/>
-      <w:lvlText w:val=""/>
-      <w:lvlJc w:val="left"/>
-      <w:pPr>
-        <w:tabs>
-          <w:tab w:val="num" w:pos="2121"/>
-        </w:tabs>
-        <w:ind w:left="2121" w:hanging="283"/>
-      </w:pPr>
-      <w:rPr>
-        <w:rFonts w:ascii="Symbol" w:hAnsi="Symbol" w:cs="Symbol" w:hint="default"/>
+      <w:lvlText w:val="◦"/>
+      <w:lvlJc w:val="left"/>
+      <w:pPr>
+        <w:tabs>
+          <w:tab w:val="num" w:pos="3240"/>
+        </w:tabs>
+        <w:ind w:left="3240" w:hanging="360"/>
+      </w:pPr>
+      <w:rPr>
+        <w:rFonts w:ascii="OpenSymbol" w:hAnsi="OpenSymbol" w:cs="OpenSymbol" w:hint="default"/>
         <w:rFonts w:cs="OpenSymbol"/>
       </w:rPr>
     </w:lvl>
-    <w:lvl w:ilvl="3">
+    <w:lvl w:ilvl="8">
       <w:start w:val="1"/>
       <w:numFmt w:val="bullet"/>
-      <w:lvlText w:val=""/>
-      <w:lvlJc w:val="left"/>
-      <w:pPr>
-        <w:tabs>
-          <w:tab w:val="num" w:pos="2828"/>
-        </w:tabs>
-        <w:ind w:left="2828" w:hanging="283"/>
-      </w:pPr>
-      <w:rPr>
-        <w:rFonts w:ascii="Symbol" w:hAnsi="Symbol" w:cs="Symbol" w:hint="default"/>
-        <w:rFonts w:cs="OpenSymbol"/>
-      </w:rPr>
-    </w:lvl>
-    <w:lvl w:ilvl="4">
-      <w:start w:val="1"/>
-      <w:numFmt w:val="bullet"/>
-      <w:lvlText w:val=""/>
-      <w:lvlJc w:val="left"/>
-      <w:pPr>
-        <w:tabs>
-          <w:tab w:val="num" w:pos="3535"/>
-        </w:tabs>
-        <w:ind w:left="3535" w:hanging="283"/>
-      </w:pPr>
-      <w:rPr>
-        <w:rFonts w:ascii="Symbol" w:hAnsi="Symbol" w:cs="Symbol" w:hint="default"/>
-        <w:rFonts w:cs="OpenSymbol"/>
-      </w:rPr>
-    </w:lvl>
-    <w:lvl w:ilvl="5">
-      <w:start w:val="1"/>
-      <w:numFmt w:val="bullet"/>
-      <w:lvlText w:val=""/>
-      <w:lvlJc w:val="left"/>
-      <w:pPr>
-        <w:tabs>
-          <w:tab w:val="num" w:pos="4242"/>
-        </w:tabs>
-        <w:ind w:left="4242" w:hanging="283"/>
-      </w:pPr>
-      <w:rPr>
-        <w:rFonts w:ascii="Symbol" w:hAnsi="Symbol" w:cs="Symbol" w:hint="default"/>
-        <w:rFonts w:cs="OpenSymbol"/>
-      </w:rPr>
-    </w:lvl>
-    <w:lvl w:ilvl="6">
-      <w:start w:val="1"/>
-      <w:numFmt w:val="bullet"/>
-      <w:lvlText w:val=""/>
-      <w:lvlJc w:val="left"/>
-      <w:pPr>
-        <w:tabs>
-          <w:tab w:val="num" w:pos="4949"/>
-        </w:tabs>
-        <w:ind w:left="4949" w:hanging="283"/>
-      </w:pPr>
-      <w:rPr>
-        <w:rFonts w:ascii="Symbol" w:hAnsi="Symbol" w:cs="Symbol" w:hint="default"/>
-        <w:rFonts w:cs="OpenSymbol"/>
-      </w:rPr>
-    </w:lvl>
-    <w:lvl w:ilvl="7">
-      <w:start w:val="1"/>
-      <w:numFmt w:val="bullet"/>
-      <w:lvlText w:val=""/>
-      <w:lvlJc w:val="left"/>
-      <w:pPr>
-        <w:tabs>
-          <w:tab w:val="num" w:pos="5656"/>
-        </w:tabs>
-        <w:ind w:left="5656" w:hanging="283"/>
-      </w:pPr>
-      <w:rPr>
-        <w:rFonts w:ascii="Symbol" w:hAnsi="Symbol" w:cs="Symbol" w:hint="default"/>
-        <w:rFonts w:cs="OpenSymbol"/>
-      </w:rPr>
-    </w:lvl>
-    <w:lvl w:ilvl="8">
-      <w:start w:val="1"/>
-      <w:numFmt w:val="bullet"/>
-      <w:lvlText w:val=""/>
-      <w:lvlJc w:val="left"/>
-      <w:pPr>
-        <w:tabs>
-          <w:tab w:val="num" w:pos="6363"/>
-        </w:tabs>
-        <w:ind w:left="6363" w:hanging="283"/>
-      </w:pPr>
-      <w:rPr>
-        <w:rFonts w:ascii="Symbol" w:hAnsi="Symbol" w:cs="Symbol" w:hint="default"/>
+      <w:lvlText w:val="▪"/>
+      <w:lvlJc w:val="left"/>
+      <w:pPr>
+        <w:tabs>
+          <w:tab w:val="num" w:pos="3600"/>
+        </w:tabs>
+        <w:ind w:left="3600" w:hanging="360"/>
+      </w:pPr>
+      <w:rPr>
+        <w:rFonts w:ascii="OpenSymbol" w:hAnsi="OpenSymbol" w:cs="OpenSymbol" w:hint="default"/>
         <w:rFonts w:cs="OpenSymbol"/>
       </w:rPr>
     </w:lvl>
@@ -2649,17 +2777,18 @@
         <w:tabs>
           <w:tab w:val="num" w:pos="720"/>
         </w:tabs>
-        <w:ind w:left="720" w:hanging="360"/>
+        <w:ind w:left="720" w:hanging="283"/>
       </w:pPr>
       <w:rPr>
         <w:rFonts w:ascii="Symbol" w:hAnsi="Symbol" w:cs="Symbol" w:hint="default"/>
+        <w:sz w:val="24"/>
         <w:rFonts w:cs="OpenSymbol"/>
       </w:rPr>
     </w:lvl>
     <w:lvl w:ilvl="1">
       <w:start w:val="1"/>
-      <w:numFmt w:val="bullet"/>
-      <w:lvlText w:val="◦"/>
+      <w:numFmt w:val="decimal"/>
+      <w:lvlText w:val="%2."/>
       <w:lvlJc w:val="left"/>
       <w:pPr>
         <w:tabs>
@@ -2667,15 +2796,11 @@
         </w:tabs>
         <w:ind w:left="1080" w:hanging="360"/>
       </w:pPr>
-      <w:rPr>
-        <w:rFonts w:ascii="OpenSymbol" w:hAnsi="OpenSymbol" w:cs="OpenSymbol" w:hint="default"/>
-        <w:rFonts w:cs="OpenSymbol"/>
-      </w:rPr>
     </w:lvl>
     <w:lvl w:ilvl="2">
       <w:start w:val="1"/>
-      <w:numFmt w:val="bullet"/>
-      <w:lvlText w:val="▪"/>
+      <w:numFmt w:val="decimal"/>
+      <w:lvlText w:val="%3."/>
       <w:lvlJc w:val="left"/>
       <w:pPr>
         <w:tabs>
@@ -2683,15 +2808,11 @@
         </w:tabs>
         <w:ind w:left="1440" w:hanging="360"/>
       </w:pPr>
-      <w:rPr>
-        <w:rFonts w:ascii="OpenSymbol" w:hAnsi="OpenSymbol" w:cs="OpenSymbol" w:hint="default"/>
-        <w:rFonts w:cs="OpenSymbol"/>
-      </w:rPr>
     </w:lvl>
     <w:lvl w:ilvl="3">
       <w:start w:val="1"/>
-      <w:numFmt w:val="bullet"/>
-      <w:lvlText w:val=""/>
+      <w:numFmt w:val="decimal"/>
+      <w:lvlText w:val="%4."/>
       <w:lvlJc w:val="left"/>
       <w:pPr>
         <w:tabs>
@@ -2699,15 +2820,11 @@
         </w:tabs>
         <w:ind w:left="1800" w:hanging="360"/>
       </w:pPr>
-      <w:rPr>
-        <w:rFonts w:ascii="Symbol" w:hAnsi="Symbol" w:cs="Symbol" w:hint="default"/>
-        <w:rFonts w:cs="OpenSymbol"/>
-      </w:rPr>
     </w:lvl>
     <w:lvl w:ilvl="4">
       <w:start w:val="1"/>
-      <w:numFmt w:val="bullet"/>
-      <w:lvlText w:val="◦"/>
+      <w:numFmt w:val="decimal"/>
+      <w:lvlText w:val="%5."/>
       <w:lvlJc w:val="left"/>
       <w:pPr>
         <w:tabs>
@@ -2715,15 +2832,11 @@
         </w:tabs>
         <w:ind w:left="2160" w:hanging="360"/>
       </w:pPr>
-      <w:rPr>
-        <w:rFonts w:ascii="OpenSymbol" w:hAnsi="OpenSymbol" w:cs="OpenSymbol" w:hint="default"/>
-        <w:rFonts w:cs="OpenSymbol"/>
-      </w:rPr>
     </w:lvl>
     <w:lvl w:ilvl="5">
       <w:start w:val="1"/>
-      <w:numFmt w:val="bullet"/>
-      <w:lvlText w:val="▪"/>
+      <w:numFmt w:val="decimal"/>
+      <w:lvlText w:val="%6."/>
       <w:lvlJc w:val="left"/>
       <w:pPr>
         <w:tabs>
@@ -2731,15 +2844,11 @@
         </w:tabs>
         <w:ind w:left="2520" w:hanging="360"/>
       </w:pPr>
-      <w:rPr>
-        <w:rFonts w:ascii="OpenSymbol" w:hAnsi="OpenSymbol" w:cs="OpenSymbol" w:hint="default"/>
-        <w:rFonts w:cs="OpenSymbol"/>
-      </w:rPr>
     </w:lvl>
     <w:lvl w:ilvl="6">
       <w:start w:val="1"/>
-      <w:numFmt w:val="bullet"/>
-      <w:lvlText w:val=""/>
+      <w:numFmt w:val="decimal"/>
+      <w:lvlText w:val="%7."/>
       <w:lvlJc w:val="left"/>
       <w:pPr>
         <w:tabs>
@@ -2747,15 +2856,11 @@
         </w:tabs>
         <w:ind w:left="2880" w:hanging="360"/>
       </w:pPr>
-      <w:rPr>
-        <w:rFonts w:ascii="Symbol" w:hAnsi="Symbol" w:cs="Symbol" w:hint="default"/>
-        <w:rFonts w:cs="OpenSymbol"/>
-      </w:rPr>
     </w:lvl>
     <w:lvl w:ilvl="7">
       <w:start w:val="1"/>
-      <w:numFmt w:val="bullet"/>
-      <w:lvlText w:val="◦"/>
+      <w:numFmt w:val="decimal"/>
+      <w:lvlText w:val="%8."/>
       <w:lvlJc w:val="left"/>
       <w:pPr>
         <w:tabs>
@@ -2763,15 +2868,11 @@
         </w:tabs>
         <w:ind w:left="3240" w:hanging="360"/>
       </w:pPr>
-      <w:rPr>
-        <w:rFonts w:ascii="OpenSymbol" w:hAnsi="OpenSymbol" w:cs="OpenSymbol" w:hint="default"/>
-        <w:rFonts w:cs="OpenSymbol"/>
-      </w:rPr>
     </w:lvl>
     <w:lvl w:ilvl="8">
       <w:start w:val="1"/>
-      <w:numFmt w:val="bullet"/>
-      <w:lvlText w:val="▪"/>
+      <w:numFmt w:val="decimal"/>
+      <w:lvlText w:val="%9."/>
       <w:lvlJc w:val="left"/>
       <w:pPr>
         <w:tabs>
@@ -2779,10 +2880,6 @@
         </w:tabs>
         <w:ind w:left="3600" w:hanging="360"/>
       </w:pPr>
-      <w:rPr>
-        <w:rFonts w:ascii="OpenSymbol" w:hAnsi="OpenSymbol" w:cs="OpenSymbol" w:hint="default"/>
-        <w:rFonts w:cs="OpenSymbol"/>
-      </w:rPr>
     </w:lvl>
   </w:abstractNum>
   <w:abstractNum w:abstractNumId="8">
@@ -2913,6 +3010,7 @@
       </w:pPr>
       <w:rPr>
         <w:rFonts w:ascii="Symbol" w:hAnsi="Symbol" w:cs="Symbol" w:hint="default"/>
+        <w:sz w:val="24"/>
         <w:rFonts w:cs="OpenSymbol"/>
       </w:rPr>
     </w:lvl>
@@ -3027,6 +3125,7 @@
       </w:pPr>
       <w:rPr>
         <w:rFonts w:ascii="Symbol" w:hAnsi="Symbol" w:cs="Symbol" w:hint="default"/>
+        <w:sz w:val="24"/>
         <w:rFonts w:cs="OpenSymbol"/>
       </w:rPr>
     </w:lvl>
@@ -3255,6 +3354,7 @@
       </w:pPr>
       <w:rPr>
         <w:rFonts w:ascii="Symbol" w:hAnsi="Symbol" w:cs="Symbol" w:hint="default"/>
+        <w:sz w:val="24"/>
         <w:rFonts w:cs="OpenSymbol"/>
       </w:rPr>
     </w:lvl>
@@ -3369,6 +3469,7 @@
       </w:pPr>
       <w:rPr>
         <w:rFonts w:ascii="Symbol" w:hAnsi="Symbol" w:cs="Symbol" w:hint="default"/>
+        <w:sz w:val="24"/>
         <w:rFonts w:cs="OpenSymbol"/>
       </w:rPr>
     </w:lvl>
@@ -3477,9 +3578,9 @@
       <w:lvlJc w:val="left"/>
       <w:pPr>
         <w:tabs>
-          <w:tab w:val="num" w:pos="720"/>
-        </w:tabs>
-        <w:ind w:left="720" w:hanging="283"/>
+          <w:tab w:val="num" w:pos="707"/>
+        </w:tabs>
+        <w:ind w:left="707" w:hanging="283"/>
       </w:pPr>
       <w:rPr>
         <w:rFonts w:ascii="Symbol" w:hAnsi="Symbol" w:cs="Symbol" w:hint="default"/>
@@ -3488,99 +3589,131 @@
     </w:lvl>
     <w:lvl w:ilvl="1">
       <w:start w:val="1"/>
-      <w:numFmt w:val="decimal"/>
-      <w:lvlText w:val="%2."/>
-      <w:lvlJc w:val="left"/>
-      <w:pPr>
-        <w:tabs>
-          <w:tab w:val="num" w:pos="1080"/>
-        </w:tabs>
-        <w:ind w:left="1080" w:hanging="360"/>
-      </w:pPr>
+      <w:numFmt w:val="bullet"/>
+      <w:lvlText w:val=""/>
+      <w:lvlJc w:val="left"/>
+      <w:pPr>
+        <w:tabs>
+          <w:tab w:val="num" w:pos="1414"/>
+        </w:tabs>
+        <w:ind w:left="1414" w:hanging="283"/>
+      </w:pPr>
+      <w:rPr>
+        <w:rFonts w:ascii="Symbol" w:hAnsi="Symbol" w:cs="Symbol" w:hint="default"/>
+        <w:rFonts w:cs="OpenSymbol"/>
+      </w:rPr>
     </w:lvl>
     <w:lvl w:ilvl="2">
       <w:start w:val="1"/>
-      <w:numFmt w:val="decimal"/>
-      <w:lvlText w:val="%3."/>
-      <w:lvlJc w:val="left"/>
-      <w:pPr>
-        <w:tabs>
-          <w:tab w:val="num" w:pos="1440"/>
-        </w:tabs>
-        <w:ind w:left="1440" w:hanging="360"/>
-      </w:pPr>
+      <w:numFmt w:val="bullet"/>
+      <w:lvlText w:val=""/>
+      <w:lvlJc w:val="left"/>
+      <w:pPr>
+        <w:tabs>
+          <w:tab w:val="num" w:pos="2121"/>
+        </w:tabs>
+        <w:ind w:left="2121" w:hanging="283"/>
+      </w:pPr>
+      <w:rPr>
+        <w:rFonts w:ascii="Symbol" w:hAnsi="Symbol" w:cs="Symbol" w:hint="default"/>
+        <w:rFonts w:cs="OpenSymbol"/>
+      </w:rPr>
     </w:lvl>
     <w:lvl w:ilvl="3">
       <w:start w:val="1"/>
-      <w:numFmt w:val="decimal"/>
-      <w:lvlText w:val="%4."/>
-      <w:lvlJc w:val="left"/>
-      <w:pPr>
-        <w:tabs>
-          <w:tab w:val="num" w:pos="1800"/>
-        </w:tabs>
-        <w:ind w:left="1800" w:hanging="360"/>
-      </w:pPr>
+      <w:numFmt w:val="bullet"/>
+      <w:lvlText w:val=""/>
+      <w:lvlJc w:val="left"/>
+      <w:pPr>
+        <w:tabs>
+          <w:tab w:val="num" w:pos="2828"/>
+        </w:tabs>
+        <w:ind w:left="2828" w:hanging="283"/>
+      </w:pPr>
+      <w:rPr>
+        <w:rFonts w:ascii="Symbol" w:hAnsi="Symbol" w:cs="Symbol" w:hint="default"/>
+        <w:rFonts w:cs="OpenSymbol"/>
+      </w:rPr>
     </w:lvl>
     <w:lvl w:ilvl="4">
       <w:start w:val="1"/>
-      <w:numFmt w:val="decimal"/>
-      <w:lvlText w:val="%5."/>
-      <w:lvlJc w:val="left"/>
-      <w:pPr>
-        <w:tabs>
-          <w:tab w:val="num" w:pos="2160"/>
-        </w:tabs>
-        <w:ind w:left="2160" w:hanging="360"/>
-      </w:pPr>
+      <w:numFmt w:val="bullet"/>
+      <w:lvlText w:val=""/>
+      <w:lvlJc w:val="left"/>
+      <w:pPr>
+        <w:tabs>
+          <w:tab w:val="num" w:pos="3535"/>
+        </w:tabs>
+        <w:ind w:left="3535" w:hanging="283"/>
+      </w:pPr>
+      <w:rPr>
+        <w:rFonts w:ascii="Symbol" w:hAnsi="Symbol" w:cs="Symbol" w:hint="default"/>
+        <w:rFonts w:cs="OpenSymbol"/>
+      </w:rPr>
     </w:lvl>
     <w:lvl w:ilvl="5">
       <w:start w:val="1"/>
-      <w:numFmt w:val="decimal"/>
-      <w:lvlText w:val="%6."/>
-      <w:lvlJc w:val="left"/>
-      <w:pPr>
-        <w:tabs>
-          <w:tab w:val="num" w:pos="2520"/>
-        </w:tabs>
-        <w:ind w:left="2520" w:hanging="360"/>
-      </w:pPr>
+      <w:numFmt w:val="bullet"/>
+      <w:lvlText w:val=""/>
+      <w:lvlJc w:val="left"/>
+      <w:pPr>
+        <w:tabs>
+          <w:tab w:val="num" w:pos="4242"/>
+        </w:tabs>
+        <w:ind w:left="4242" w:hanging="283"/>
+      </w:pPr>
+      <w:rPr>
+        <w:rFonts w:ascii="Symbol" w:hAnsi="Symbol" w:cs="Symbol" w:hint="default"/>
+        <w:rFonts w:cs="OpenSymbol"/>
+      </w:rPr>
     </w:lvl>
     <w:lvl w:ilvl="6">
       <w:start w:val="1"/>
-      <w:numFmt w:val="decimal"/>
-      <w:lvlText w:val="%7."/>
-      <w:lvlJc w:val="left"/>
-      <w:pPr>
-        <w:tabs>
-          <w:tab w:val="num" w:pos="2880"/>
-        </w:tabs>
-        <w:ind w:left="2880" w:hanging="360"/>
-      </w:pPr>
+      <w:numFmt w:val="bullet"/>
+      <w:lvlText w:val=""/>
+      <w:lvlJc w:val="left"/>
+      <w:pPr>
+        <w:tabs>
+          <w:tab w:val="num" w:pos="4949"/>
+        </w:tabs>
+        <w:ind w:left="4949" w:hanging="283"/>
+      </w:pPr>
+      <w:rPr>
+        <w:rFonts w:ascii="Symbol" w:hAnsi="Symbol" w:cs="Symbol" w:hint="default"/>
+        <w:rFonts w:cs="OpenSymbol"/>
+      </w:rPr>
     </w:lvl>
     <w:lvl w:ilvl="7">
       <w:start w:val="1"/>
-      <w:numFmt w:val="decimal"/>
-      <w:lvlText w:val="%8."/>
-      <w:lvlJc w:val="left"/>
-      <w:pPr>
-        <w:tabs>
-          <w:tab w:val="num" w:pos="3240"/>
-        </w:tabs>
-        <w:ind w:left="3240" w:hanging="360"/>
-      </w:pPr>
+      <w:numFmt w:val="bullet"/>
+      <w:lvlText w:val=""/>
+      <w:lvlJc w:val="left"/>
+      <w:pPr>
+        <w:tabs>
+          <w:tab w:val="num" w:pos="5656"/>
+        </w:tabs>
+        <w:ind w:left="5656" w:hanging="283"/>
+      </w:pPr>
+      <w:rPr>
+        <w:rFonts w:ascii="Symbol" w:hAnsi="Symbol" w:cs="Symbol" w:hint="default"/>
+        <w:rFonts w:cs="OpenSymbol"/>
+      </w:rPr>
     </w:lvl>
     <w:lvl w:ilvl="8">
       <w:start w:val="1"/>
-      <w:numFmt w:val="decimal"/>
-      <w:lvlText w:val="%9."/>
-      <w:lvlJc w:val="left"/>
-      <w:pPr>
-        <w:tabs>
-          <w:tab w:val="num" w:pos="3600"/>
-        </w:tabs>
-        <w:ind w:left="3600" w:hanging="360"/>
-      </w:pPr>
+      <w:numFmt w:val="bullet"/>
+      <w:lvlText w:val=""/>
+      <w:lvlJc w:val="left"/>
+      <w:pPr>
+        <w:tabs>
+          <w:tab w:val="num" w:pos="6363"/>
+        </w:tabs>
+        <w:ind w:left="6363" w:hanging="283"/>
+      </w:pPr>
+      <w:rPr>
+        <w:rFonts w:ascii="Symbol" w:hAnsi="Symbol" w:cs="Symbol" w:hint="default"/>
+        <w:rFonts w:cs="OpenSymbol"/>
+      </w:rPr>
     </w:lvl>
   </w:abstractNum>
   <w:abstractNum w:abstractNumId="15">
@@ -3883,142 +4016,111 @@
       <w:lvlJc w:val="left"/>
       <w:pPr>
         <w:tabs>
-          <w:tab w:val="num" w:pos="707"/>
-        </w:tabs>
-        <w:ind w:left="707" w:hanging="283"/>
+          <w:tab w:val="num" w:pos="720"/>
+        </w:tabs>
+        <w:ind w:left="720" w:hanging="283"/>
       </w:pPr>
       <w:rPr>
         <w:rFonts w:ascii="Symbol" w:hAnsi="Symbol" w:cs="Symbol" w:hint="default"/>
+        <w:sz w:val="24"/>
         <w:rFonts w:cs="OpenSymbol"/>
       </w:rPr>
     </w:lvl>
     <w:lvl w:ilvl="1">
       <w:start w:val="1"/>
-      <w:numFmt w:val="bullet"/>
-      <w:lvlText w:val=""/>
-      <w:lvlJc w:val="left"/>
-      <w:pPr>
-        <w:tabs>
-          <w:tab w:val="num" w:pos="1414"/>
-        </w:tabs>
-        <w:ind w:left="1414" w:hanging="283"/>
-      </w:pPr>
-      <w:rPr>
-        <w:rFonts w:ascii="Symbol" w:hAnsi="Symbol" w:cs="Symbol" w:hint="default"/>
-        <w:rFonts w:cs="OpenSymbol"/>
-      </w:rPr>
+      <w:numFmt w:val="decimal"/>
+      <w:lvlText w:val="%2."/>
+      <w:lvlJc w:val="left"/>
+      <w:pPr>
+        <w:tabs>
+          <w:tab w:val="num" w:pos="1080"/>
+        </w:tabs>
+        <w:ind w:left="1080" w:hanging="360"/>
+      </w:pPr>
     </w:lvl>
     <w:lvl w:ilvl="2">
       <w:start w:val="1"/>
-      <w:numFmt w:val="bullet"/>
-      <w:lvlText w:val=""/>
-      <w:lvlJc w:val="left"/>
-      <w:pPr>
-        <w:tabs>
-          <w:tab w:val="num" w:pos="2121"/>
-        </w:tabs>
-        <w:ind w:left="2121" w:hanging="283"/>
-      </w:pPr>
-      <w:rPr>
-        <w:rFonts w:ascii="Symbol" w:hAnsi="Symbol" w:cs="Symbol" w:hint="default"/>
-        <w:rFonts w:cs="OpenSymbol"/>
-      </w:rPr>
+      <w:numFmt w:val="decimal"/>
+      <w:lvlText w:val="%3."/>
+      <w:lvlJc w:val="left"/>
+      <w:pPr>
+        <w:tabs>
+          <w:tab w:val="num" w:pos="1440"/>
+        </w:tabs>
+        <w:ind w:left="1440" w:hanging="360"/>
+      </w:pPr>
     </w:lvl>
     <w:lvl w:ilvl="3">
       <w:start w:val="1"/>
-      <w:numFmt w:val="bullet"/>
-      <w:lvlText w:val=""/>
-      <w:lvlJc w:val="left"/>
-      <w:pPr>
-        <w:tabs>
-          <w:tab w:val="num" w:pos="2828"/>
-        </w:tabs>
-        <w:ind w:left="2828" w:hanging="283"/>
-      </w:pPr>
-      <w:rPr>
-        <w:rFonts w:ascii="Symbol" w:hAnsi="Symbol" w:cs="Symbol" w:hint="default"/>
-        <w:rFonts w:cs="OpenSymbol"/>
-      </w:rPr>
+      <w:numFmt w:val="decimal"/>
+      <w:lvlText w:val="%4."/>
+      <w:lvlJc w:val="left"/>
+      <w:pPr>
+        <w:tabs>
+          <w:tab w:val="num" w:pos="1800"/>
+        </w:tabs>
+        <w:ind w:left="1800" w:hanging="360"/>
+      </w:pPr>
     </w:lvl>
     <w:lvl w:ilvl="4">
       <w:start w:val="1"/>
-      <w:numFmt w:val="bullet"/>
-      <w:lvlText w:val=""/>
-      <w:lvlJc w:val="left"/>
-      <w:pPr>
-        <w:tabs>
-          <w:tab w:val="num" w:pos="3535"/>
-        </w:tabs>
-        <w:ind w:left="3535" w:hanging="283"/>
-      </w:pPr>
-      <w:rPr>
-        <w:rFonts w:ascii="Symbol" w:hAnsi="Symbol" w:cs="Symbol" w:hint="default"/>
-        <w:rFonts w:cs="OpenSymbol"/>
-      </w:rPr>
+      <w:numFmt w:val="decimal"/>
+      <w:lvlText w:val="%5."/>
+      <w:lvlJc w:val="left"/>
+      <w:pPr>
+        <w:tabs>
+          <w:tab w:val="num" w:pos="2160"/>
+        </w:tabs>
+        <w:ind w:left="2160" w:hanging="360"/>
+      </w:pPr>
     </w:lvl>
     <w:lvl w:ilvl="5">
       <w:start w:val="1"/>
-      <w:numFmt w:val="bullet"/>
-      <w:lvlText w:val=""/>
-      <w:lvlJc w:val="left"/>
-      <w:pPr>
-        <w:tabs>
-          <w:tab w:val="num" w:pos="4242"/>
-        </w:tabs>
-        <w:ind w:left="4242" w:hanging="283"/>
-      </w:pPr>
-      <w:rPr>
-        <w:rFonts w:ascii="Symbol" w:hAnsi="Symbol" w:cs="Symbol" w:hint="default"/>
-        <w:rFonts w:cs="OpenSymbol"/>
-      </w:rPr>
+      <w:numFmt w:val="decimal"/>
+      <w:lvlText w:val="%6."/>
+      <w:lvlJc w:val="left"/>
+      <w:pPr>
+        <w:tabs>
+          <w:tab w:val="num" w:pos="2520"/>
+        </w:tabs>
+        <w:ind w:left="2520" w:hanging="360"/>
+      </w:pPr>
     </w:lvl>
     <w:lvl w:ilvl="6">
       <w:start w:val="1"/>
-      <w:numFmt w:val="bullet"/>
-      <w:lvlText w:val=""/>
-      <w:lvlJc w:val="left"/>
-      <w:pPr>
-        <w:tabs>
-          <w:tab w:val="num" w:pos="4949"/>
-        </w:tabs>
-        <w:ind w:left="4949" w:hanging="283"/>
-      </w:pPr>
-      <w:rPr>
-        <w:rFonts w:ascii="Symbol" w:hAnsi="Symbol" w:cs="Symbol" w:hint="default"/>
-        <w:rFonts w:cs="OpenSymbol"/>
-      </w:rPr>
+      <w:numFmt w:val="decimal"/>
+      <w:lvlText w:val="%7."/>
+      <w:lvlJc w:val="left"/>
+      <w:pPr>
+        <w:tabs>
+          <w:tab w:val="num" w:pos="2880"/>
+        </w:tabs>
+        <w:ind w:left="2880" w:hanging="360"/>
+      </w:pPr>
     </w:lvl>
     <w:lvl w:ilvl="7">
       <w:start w:val="1"/>
-      <w:numFmt w:val="bullet"/>
-      <w:lvlText w:val=""/>
-      <w:lvlJc w:val="left"/>
-      <w:pPr>
-        <w:tabs>
-          <w:tab w:val="num" w:pos="5656"/>
-        </w:tabs>
-        <w:ind w:left="5656" w:hanging="283"/>
-      </w:pPr>
-      <w:rPr>
-        <w:rFonts w:ascii="Symbol" w:hAnsi="Symbol" w:cs="Symbol" w:hint="default"/>
-        <w:rFonts w:cs="OpenSymbol"/>
-      </w:rPr>
+      <w:numFmt w:val="decimal"/>
+      <w:lvlText w:val="%8."/>
+      <w:lvlJc w:val="left"/>
+      <w:pPr>
+        <w:tabs>
+          <w:tab w:val="num" w:pos="3240"/>
+        </w:tabs>
+        <w:ind w:left="3240" w:hanging="360"/>
+      </w:pPr>
     </w:lvl>
     <w:lvl w:ilvl="8">
       <w:start w:val="1"/>
-      <w:numFmt w:val="bullet"/>
-      <w:lvlText w:val=""/>
-      <w:lvlJc w:val="left"/>
-      <w:pPr>
-        <w:tabs>
-          <w:tab w:val="num" w:pos="6363"/>
-        </w:tabs>
-        <w:ind w:left="6363" w:hanging="283"/>
-      </w:pPr>
-      <w:rPr>
-        <w:rFonts w:ascii="Symbol" w:hAnsi="Symbol" w:cs="Symbol" w:hint="default"/>
-        <w:rFonts w:cs="OpenSymbol"/>
-      </w:rPr>
+      <w:numFmt w:val="decimal"/>
+      <w:lvlText w:val="%9."/>
+      <w:lvlJc w:val="left"/>
+      <w:pPr>
+        <w:tabs>
+          <w:tab w:val="num" w:pos="3600"/>
+        </w:tabs>
+        <w:ind w:left="3600" w:hanging="360"/>
+      </w:pPr>
     </w:lvl>
   </w:abstractNum>
   <w:abstractNum w:abstractNumId="18">
@@ -4035,6 +4137,7 @@
       </w:pPr>
       <w:rPr>
         <w:rFonts w:ascii="Symbol" w:hAnsi="Symbol" w:cs="Symbol" w:hint="default"/>
+        <w:sz w:val="24"/>
         <w:rFonts w:cs="OpenSymbol"/>
       </w:rPr>
     </w:lvl>
@@ -4149,6 +4252,7 @@
       </w:pPr>
       <w:rPr>
         <w:rFonts w:ascii="Symbol" w:hAnsi="Symbol" w:cs="Symbol" w:hint="default"/>
+        <w:sz w:val="24"/>
         <w:rFonts w:cs="OpenSymbol"/>
       </w:rPr>
     </w:lvl>
@@ -4263,120 +4367,7 @@
       </w:pPr>
       <w:rPr>
         <w:rFonts w:ascii="Symbol" w:hAnsi="Symbol" w:cs="Symbol" w:hint="default"/>
-        <w:rFonts w:cs="OpenSymbol"/>
-      </w:rPr>
-    </w:lvl>
-    <w:lvl w:ilvl="1">
-      <w:start w:val="1"/>
-      <w:numFmt w:val="decimal"/>
-      <w:lvlText w:val="%2."/>
-      <w:lvlJc w:val="left"/>
-      <w:pPr>
-        <w:tabs>
-          <w:tab w:val="num" w:pos="1080"/>
-        </w:tabs>
-        <w:ind w:left="1080" w:hanging="360"/>
-      </w:pPr>
-    </w:lvl>
-    <w:lvl w:ilvl="2">
-      <w:start w:val="1"/>
-      <w:numFmt w:val="decimal"/>
-      <w:lvlText w:val="%3."/>
-      <w:lvlJc w:val="left"/>
-      <w:pPr>
-        <w:tabs>
-          <w:tab w:val="num" w:pos="1440"/>
-        </w:tabs>
-        <w:ind w:left="1440" w:hanging="360"/>
-      </w:pPr>
-    </w:lvl>
-    <w:lvl w:ilvl="3">
-      <w:start w:val="1"/>
-      <w:numFmt w:val="decimal"/>
-      <w:lvlText w:val="%4."/>
-      <w:lvlJc w:val="left"/>
-      <w:pPr>
-        <w:tabs>
-          <w:tab w:val="num" w:pos="1800"/>
-        </w:tabs>
-        <w:ind w:left="1800" w:hanging="360"/>
-      </w:pPr>
-    </w:lvl>
-    <w:lvl w:ilvl="4">
-      <w:start w:val="1"/>
-      <w:numFmt w:val="decimal"/>
-      <w:lvlText w:val="%5."/>
-      <w:lvlJc w:val="left"/>
-      <w:pPr>
-        <w:tabs>
-          <w:tab w:val="num" w:pos="2160"/>
-        </w:tabs>
-        <w:ind w:left="2160" w:hanging="360"/>
-      </w:pPr>
-    </w:lvl>
-    <w:lvl w:ilvl="5">
-      <w:start w:val="1"/>
-      <w:numFmt w:val="decimal"/>
-      <w:lvlText w:val="%6."/>
-      <w:lvlJc w:val="left"/>
-      <w:pPr>
-        <w:tabs>
-          <w:tab w:val="num" w:pos="2520"/>
-        </w:tabs>
-        <w:ind w:left="2520" w:hanging="360"/>
-      </w:pPr>
-    </w:lvl>
-    <w:lvl w:ilvl="6">
-      <w:start w:val="1"/>
-      <w:numFmt w:val="decimal"/>
-      <w:lvlText w:val="%7."/>
-      <w:lvlJc w:val="left"/>
-      <w:pPr>
-        <w:tabs>
-          <w:tab w:val="num" w:pos="2880"/>
-        </w:tabs>
-        <w:ind w:left="2880" w:hanging="360"/>
-      </w:pPr>
-    </w:lvl>
-    <w:lvl w:ilvl="7">
-      <w:start w:val="1"/>
-      <w:numFmt w:val="decimal"/>
-      <w:lvlText w:val="%8."/>
-      <w:lvlJc w:val="left"/>
-      <w:pPr>
-        <w:tabs>
-          <w:tab w:val="num" w:pos="3240"/>
-        </w:tabs>
-        <w:ind w:left="3240" w:hanging="360"/>
-      </w:pPr>
-    </w:lvl>
-    <w:lvl w:ilvl="8">
-      <w:start w:val="1"/>
-      <w:numFmt w:val="decimal"/>
-      <w:lvlText w:val="%9."/>
-      <w:lvlJc w:val="left"/>
-      <w:pPr>
-        <w:tabs>
-          <w:tab w:val="num" w:pos="3600"/>
-        </w:tabs>
-        <w:ind w:left="3600" w:hanging="360"/>
-      </w:pPr>
-    </w:lvl>
-  </w:abstractNum>
-  <w:abstractNum w:abstractNumId="21">
-    <w:lvl w:ilvl="0">
-      <w:start w:val="1"/>
-      <w:numFmt w:val="bullet"/>
-      <w:lvlText w:val=""/>
-      <w:lvlJc w:val="left"/>
-      <w:pPr>
-        <w:tabs>
-          <w:tab w:val="num" w:pos="720"/>
-        </w:tabs>
-        <w:ind w:left="720" w:hanging="283"/>
-      </w:pPr>
-      <w:rPr>
-        <w:rFonts w:ascii="Symbol" w:hAnsi="Symbol" w:cs="Symbol" w:hint="default"/>
+        <w:sz w:val="24"/>
         <w:rFonts w:cs="OpenSymbol"/>
       </w:rPr>
     </w:lvl>
@@ -4536,9 +4527,6 @@
   </w:num>
   <w:num w:numId="20">
     <w:abstractNumId w:val="20"/>
-  </w:num>
-  <w:num w:numId="21">
-    <w:abstractNumId w:val="21"/>
   </w:num>
 </w:numbering>
 </file>
@@ -6529,7 +6517,7 @@
       <w:jc w:val="left"/>
     </w:pPr>
     <w:rPr>
-      <w:rFonts w:eastAsia="Times New Roman" w:cs="Arial" w:ascii="Arial" w:hAnsi="Arial"/>
+      <w:rFonts w:ascii="Arial" w:hAnsi="Arial" w:eastAsia="Times New Roman" w:cs="Arial"/>
       <w:color w:val="auto"/>
       <w:kern w:val="0"/>
       <w:sz w:val="24"/>

</xml_diff>